<commit_message>
docs: actualizacion de la documentacion. Se agrega el diagrama del modelo entidad relacion
</commit_message>
<xml_diff>
--- a/docs/Documentacion.docx
+++ b/docs/Documentacion.docx
@@ -528,13 +528,23 @@
           <w:szCs w:val="24"/>
         </w:rPr>
       </w:pPr>
-      <w:r>
-        <w:rPr>
-          <w:rFonts w:ascii="Times New Roman" w:hAnsi="Times New Roman" w:cs="Times New Roman"/>
-          <w:sz w:val="24"/>
-          <w:szCs w:val="24"/>
-        </w:rPr>
-        <w:t>Supply Manager</w:t>
+      <w:proofErr w:type="spellStart"/>
+      <w:r>
+        <w:rPr>
+          <w:rFonts w:ascii="Times New Roman" w:hAnsi="Times New Roman" w:cs="Times New Roman"/>
+          <w:sz w:val="24"/>
+          <w:szCs w:val="24"/>
+        </w:rPr>
+        <w:t>Supply</w:t>
+      </w:r>
+      <w:proofErr w:type="spellEnd"/>
+      <w:r>
+        <w:rPr>
+          <w:rFonts w:ascii="Times New Roman" w:hAnsi="Times New Roman" w:cs="Times New Roman"/>
+          <w:sz w:val="24"/>
+          <w:szCs w:val="24"/>
+        </w:rPr>
+        <w:t xml:space="preserve"> Manager</w:t>
       </w:r>
     </w:p>
     <w:p>
@@ -835,7 +845,25 @@
           <w:sz w:val="24"/>
           <w:szCs w:val="24"/>
         </w:rPr>
-        <w:t>de escritorio en C# Windows Forms para gestionar el control de insumos y abastecimiento empresarial</w:t>
+        <w:t xml:space="preserve">de escritorio en C# Windows </w:t>
+      </w:r>
+      <w:proofErr w:type="spellStart"/>
+      <w:r>
+        <w:rPr>
+          <w:rFonts w:ascii="Times New Roman" w:hAnsi="Times New Roman" w:cs="Times New Roman"/>
+          <w:sz w:val="24"/>
+          <w:szCs w:val="24"/>
+        </w:rPr>
+        <w:t>Forms</w:t>
+      </w:r>
+      <w:proofErr w:type="spellEnd"/>
+      <w:r>
+        <w:rPr>
+          <w:rFonts w:ascii="Times New Roman" w:hAnsi="Times New Roman" w:cs="Times New Roman"/>
+          <w:sz w:val="24"/>
+          <w:szCs w:val="24"/>
+        </w:rPr>
+        <w:t xml:space="preserve"> para gestionar el control de insumos y abastecimiento empresarial</w:t>
       </w:r>
       <w:r>
         <w:rPr>
@@ -1160,8 +1188,20 @@
           <w:sz w:val="24"/>
           <w:szCs w:val="24"/>
         </w:rPr>
-        <w:t>RF1: Login</w:t>
-      </w:r>
+        <w:t xml:space="preserve">RF1: </w:t>
+      </w:r>
+      <w:proofErr w:type="spellStart"/>
+      <w:r>
+        <w:rPr>
+          <w:rFonts w:ascii="Times New Roman" w:hAnsi="Times New Roman" w:cs="Times New Roman"/>
+          <w:b/>
+          <w:bCs/>
+          <w:sz w:val="24"/>
+          <w:szCs w:val="24"/>
+        </w:rPr>
+        <w:t>Login</w:t>
+      </w:r>
+      <w:proofErr w:type="spellEnd"/>
     </w:p>
     <w:bookmarkEnd w:id="0"/>
     <w:p>
@@ -1974,42 +2014,22 @@
           <w:sz w:val="24"/>
           <w:szCs w:val="24"/>
         </w:rPr>
-        <w:t>s</w:t>
-      </w:r>
-      <w:r>
-        <w:rPr>
-          <w:rFonts w:ascii="Times New Roman" w:hAnsi="Times New Roman" w:cs="Times New Roman"/>
-          <w:sz w:val="24"/>
-          <w:szCs w:val="24"/>
-        </w:rPr>
-        <w:t>istema desarrollado en</w:t>
-      </w:r>
-      <w:r>
-        <w:rPr>
-          <w:rFonts w:ascii="Times New Roman" w:hAnsi="Times New Roman" w:cs="Times New Roman"/>
-          <w:sz w:val="24"/>
-          <w:szCs w:val="24"/>
-        </w:rPr>
-        <w:t xml:space="preserve"> </w:t>
-      </w:r>
-      <w:r>
-        <w:rPr>
-          <w:rFonts w:ascii="Times New Roman" w:hAnsi="Times New Roman" w:cs="Times New Roman"/>
-        </w:rPr>
-        <w:t>C#</w:t>
-      </w:r>
-      <w:r>
-        <w:rPr>
-          <w:rFonts w:ascii="Times New Roman" w:hAnsi="Times New Roman" w:cs="Times New Roman"/>
-        </w:rPr>
-        <w:t xml:space="preserve">, </w:t>
-      </w:r>
-      <w:r>
-        <w:rPr>
-          <w:rFonts w:ascii="Times New Roman" w:hAnsi="Times New Roman" w:cs="Times New Roman"/>
-        </w:rPr>
-        <w:t>Windows Forms</w:t>
-      </w:r>
+        <w:t xml:space="preserve">sistema desarrollado en </w:t>
+      </w:r>
+      <w:r>
+        <w:rPr>
+          <w:rFonts w:ascii="Times New Roman" w:hAnsi="Times New Roman" w:cs="Times New Roman"/>
+        </w:rPr>
+        <w:t xml:space="preserve">C#, Windows </w:t>
+      </w:r>
+      <w:proofErr w:type="spellStart"/>
+      <w:r>
+        <w:rPr>
+          <w:rFonts w:ascii="Times New Roman" w:hAnsi="Times New Roman" w:cs="Times New Roman"/>
+        </w:rPr>
+        <w:t>Forms</w:t>
+      </w:r>
+      <w:proofErr w:type="spellEnd"/>
       <w:r>
         <w:rPr>
           <w:rFonts w:ascii="Times New Roman" w:hAnsi="Times New Roman" w:cs="Times New Roman"/>
@@ -2017,10 +2037,7 @@
         <w:t xml:space="preserve"> y </w:t>
       </w:r>
       <w:r>
-        <w:t>SQL Server</w:t>
-      </w:r>
-      <w:r>
-        <w:t>.</w:t>
+        <w:t>SQL Server.</w:t>
       </w:r>
     </w:p>
     <w:p>
@@ -2239,7 +2256,25 @@
           <w:sz w:val="24"/>
           <w:szCs w:val="24"/>
         </w:rPr>
-        <w:t>mplementación de patrones GoF.</w:t>
+        <w:t xml:space="preserve">mplementación de patrones </w:t>
+      </w:r>
+      <w:proofErr w:type="spellStart"/>
+      <w:r>
+        <w:rPr>
+          <w:rFonts w:ascii="Times New Roman" w:hAnsi="Times New Roman" w:cs="Times New Roman"/>
+          <w:sz w:val="24"/>
+          <w:szCs w:val="24"/>
+        </w:rPr>
+        <w:t>GoF</w:t>
+      </w:r>
+      <w:proofErr w:type="spellEnd"/>
+      <w:r>
+        <w:rPr>
+          <w:rFonts w:ascii="Times New Roman" w:hAnsi="Times New Roman" w:cs="Times New Roman"/>
+          <w:sz w:val="24"/>
+          <w:szCs w:val="24"/>
+        </w:rPr>
+        <w:t>.</w:t>
       </w:r>
     </w:p>
     <w:p>
@@ -2385,7 +2420,25 @@
           <w:sz w:val="24"/>
           <w:szCs w:val="24"/>
         </w:rPr>
-        <w:t>mplementación de patrones GoF.</w:t>
+        <w:t xml:space="preserve">mplementación de patrones </w:t>
+      </w:r>
+      <w:proofErr w:type="spellStart"/>
+      <w:r>
+        <w:rPr>
+          <w:rFonts w:ascii="Times New Roman" w:hAnsi="Times New Roman" w:cs="Times New Roman"/>
+          <w:sz w:val="24"/>
+          <w:szCs w:val="24"/>
+        </w:rPr>
+        <w:t>GoF</w:t>
+      </w:r>
+      <w:proofErr w:type="spellEnd"/>
+      <w:r>
+        <w:rPr>
+          <w:rFonts w:ascii="Times New Roman" w:hAnsi="Times New Roman" w:cs="Times New Roman"/>
+          <w:sz w:val="24"/>
+          <w:szCs w:val="24"/>
+        </w:rPr>
+        <w:t>.</w:t>
       </w:r>
     </w:p>
     <w:p>
@@ -2644,17 +2697,7 @@
           <w:sz w:val="24"/>
           <w:szCs w:val="24"/>
         </w:rPr>
-        <w:t>Re</w:t>
-      </w:r>
-      <w:r>
-        <w:rPr>
-          <w:rFonts w:ascii="Times New Roman" w:hAnsi="Times New Roman" w:cs="Times New Roman"/>
-          <w:b/>
-          <w:bCs/>
-          <w:sz w:val="24"/>
-          <w:szCs w:val="24"/>
-        </w:rPr>
-        <w:t>glas de negocio</w:t>
+        <w:t>Reglas de negocio</w:t>
       </w:r>
     </w:p>
     <w:p>
@@ -2755,43 +2798,15 @@
           <w:szCs w:val="24"/>
         </w:rPr>
         <w:lastRenderedPageBreak/>
-        <w:t>RN</w:t>
-      </w:r>
-      <w:r>
-        <w:rPr>
-          <w:rFonts w:ascii="Times New Roman" w:hAnsi="Times New Roman" w:cs="Times New Roman"/>
-          <w:b/>
-          <w:bCs/>
-          <w:sz w:val="24"/>
-          <w:szCs w:val="24"/>
-        </w:rPr>
-        <w:t>2</w:t>
-      </w:r>
-      <w:r>
-        <w:rPr>
-          <w:rFonts w:ascii="Times New Roman" w:hAnsi="Times New Roman" w:cs="Times New Roman"/>
-          <w:b/>
-          <w:bCs/>
-          <w:sz w:val="24"/>
-          <w:szCs w:val="24"/>
-        </w:rPr>
-        <w:t xml:space="preserve">: </w:t>
-      </w:r>
-      <w:r>
-        <w:rPr>
-          <w:rFonts w:ascii="Times New Roman" w:hAnsi="Times New Roman" w:cs="Times New Roman"/>
-          <w:sz w:val="24"/>
-          <w:szCs w:val="24"/>
-        </w:rPr>
-        <w:t>t</w:t>
-      </w:r>
-      <w:r>
-        <w:rPr>
-          <w:rFonts w:ascii="Times New Roman" w:hAnsi="Times New Roman" w:cs="Times New Roman"/>
-          <w:sz w:val="24"/>
-          <w:szCs w:val="24"/>
-        </w:rPr>
-        <w:t>odo insumo debe tener definido un nivel mínimo de existencia mayor a cero.</w:t>
+        <w:t xml:space="preserve">RN2: </w:t>
+      </w:r>
+      <w:r>
+        <w:rPr>
+          <w:rFonts w:ascii="Times New Roman" w:hAnsi="Times New Roman" w:cs="Times New Roman"/>
+          <w:sz w:val="24"/>
+          <w:szCs w:val="24"/>
+        </w:rPr>
+        <w:t>todo insumo debe tener definido un nivel mínimo de existencia mayor a cero.</w:t>
       </w:r>
     </w:p>
     <w:p>
@@ -2818,27 +2833,7 @@
           <w:sz w:val="24"/>
           <w:szCs w:val="24"/>
         </w:rPr>
-        <w:t>RN</w:t>
-      </w:r>
-      <w:r>
-        <w:rPr>
-          <w:rFonts w:ascii="Times New Roman" w:hAnsi="Times New Roman" w:cs="Times New Roman"/>
-          <w:b/>
-          <w:bCs/>
-          <w:sz w:val="24"/>
-          <w:szCs w:val="24"/>
-        </w:rPr>
-        <w:t>3</w:t>
-      </w:r>
-      <w:r>
-        <w:rPr>
-          <w:rFonts w:ascii="Times New Roman" w:hAnsi="Times New Roman" w:cs="Times New Roman"/>
-          <w:b/>
-          <w:bCs/>
-          <w:sz w:val="24"/>
-          <w:szCs w:val="24"/>
-        </w:rPr>
-        <w:t xml:space="preserve">: </w:t>
+        <w:t xml:space="preserve">RN3: </w:t>
       </w:r>
       <w:r>
         <w:rPr>
@@ -3047,15 +3042,7 @@
           <w:sz w:val="24"/>
           <w:szCs w:val="24"/>
         </w:rPr>
-        <w:t>t</w:t>
-      </w:r>
-      <w:r>
-        <w:rPr>
-          <w:rFonts w:ascii="Times New Roman" w:hAnsi="Times New Roman" w:cs="Times New Roman"/>
-          <w:sz w:val="24"/>
-          <w:szCs w:val="24"/>
-        </w:rPr>
-        <w:t>oda operación realizada sobre inventario debe quedar registrada</w:t>
+        <w:t>toda operación realizada sobre inventario debe quedar registrada</w:t>
       </w:r>
       <w:r>
         <w:rPr>
@@ -3233,7 +3220,25 @@
           <w:sz w:val="24"/>
           <w:szCs w:val="24"/>
         </w:rPr>
-        <w:t>El sistema será implementado utilizando C# Windows Forms como tecnología de interfaz de usuario y SQL Server como sistema gestor de base de datos relacional.</w:t>
+        <w:t xml:space="preserve">El sistema será implementado utilizando C# Windows </w:t>
+      </w:r>
+      <w:proofErr w:type="spellStart"/>
+      <w:r>
+        <w:rPr>
+          <w:rFonts w:ascii="Times New Roman" w:hAnsi="Times New Roman" w:cs="Times New Roman"/>
+          <w:sz w:val="24"/>
+          <w:szCs w:val="24"/>
+        </w:rPr>
+        <w:t>Forms</w:t>
+      </w:r>
+      <w:proofErr w:type="spellEnd"/>
+      <w:r>
+        <w:rPr>
+          <w:rFonts w:ascii="Times New Roman" w:hAnsi="Times New Roman" w:cs="Times New Roman"/>
+          <w:sz w:val="24"/>
+          <w:szCs w:val="24"/>
+        </w:rPr>
+        <w:t xml:space="preserve"> como tecnología de interfaz de usuario y SQL Server como sistema gestor de base de datos relacional.</w:t>
       </w:r>
     </w:p>
     <w:p>
@@ -3405,7 +3410,25 @@
           <w:sz w:val="24"/>
           <w:szCs w:val="24"/>
         </w:rPr>
-        <w:t>desarrollada en Windows Forms.</w:t>
+        <w:t xml:space="preserve">desarrollada en Windows </w:t>
+      </w:r>
+      <w:proofErr w:type="spellStart"/>
+      <w:r>
+        <w:rPr>
+          <w:rFonts w:ascii="Times New Roman" w:hAnsi="Times New Roman" w:cs="Times New Roman"/>
+          <w:sz w:val="24"/>
+          <w:szCs w:val="24"/>
+        </w:rPr>
+        <w:t>Forms</w:t>
+      </w:r>
+      <w:proofErr w:type="spellEnd"/>
+      <w:r>
+        <w:rPr>
+          <w:rFonts w:ascii="Times New Roman" w:hAnsi="Times New Roman" w:cs="Times New Roman"/>
+          <w:sz w:val="24"/>
+          <w:szCs w:val="24"/>
+        </w:rPr>
+        <w:t>.</w:t>
       </w:r>
       <w:r>
         <w:rPr>
@@ -3548,23 +3571,7 @@
           <w:sz w:val="24"/>
           <w:szCs w:val="24"/>
         </w:rPr>
-        <w:t>Capa de Lógica de Negocio (BLL)</w:t>
-      </w:r>
-      <w:r>
-        <w:rPr>
-          <w:rFonts w:ascii="Times New Roman" w:hAnsi="Times New Roman" w:cs="Times New Roman"/>
-          <w:sz w:val="24"/>
-          <w:szCs w:val="24"/>
-        </w:rPr>
-        <w:t>: l</w:t>
-      </w:r>
-      <w:r>
-        <w:rPr>
-          <w:rFonts w:ascii="Times New Roman" w:hAnsi="Times New Roman" w:cs="Times New Roman"/>
-          <w:sz w:val="24"/>
-          <w:szCs w:val="24"/>
-        </w:rPr>
-        <w:t>a capa de lógica de negocio contiene las reglas, políticas y procesos principales del sistema.</w:t>
+        <w:t>Capa de Lógica de Negocio (BLL): la capa de lógica de negocio contiene las reglas, políticas y procesos principales del sistema.</w:t>
       </w:r>
       <w:r>
         <w:rPr>
@@ -3664,31 +3671,7 @@
           <w:sz w:val="24"/>
           <w:szCs w:val="24"/>
         </w:rPr>
-        <w:t>generación de alertas de stock crítico</w:t>
-      </w:r>
-      <w:r>
-        <w:rPr>
-          <w:rFonts w:ascii="Times New Roman" w:hAnsi="Times New Roman" w:cs="Times New Roman"/>
-          <w:sz w:val="24"/>
-          <w:szCs w:val="24"/>
-        </w:rPr>
-        <w:t xml:space="preserve"> y </w:t>
-      </w:r>
-      <w:r>
-        <w:rPr>
-          <w:rFonts w:ascii="Times New Roman" w:hAnsi="Times New Roman" w:cs="Times New Roman"/>
-          <w:sz w:val="24"/>
-          <w:szCs w:val="24"/>
-        </w:rPr>
-        <w:t>cálculo de proyección de reabastecimiento</w:t>
-      </w:r>
-      <w:r>
-        <w:rPr>
-          <w:rFonts w:ascii="Times New Roman" w:hAnsi="Times New Roman" w:cs="Times New Roman"/>
-          <w:sz w:val="24"/>
-          <w:szCs w:val="24"/>
-        </w:rPr>
-        <w:t>.</w:t>
+        <w:t>generación de alertas de stock crítico y cálculo de proyección de reabastecimiento.</w:t>
       </w:r>
     </w:p>
     <w:p>
@@ -4102,7 +4085,43 @@
           <w:sz w:val="24"/>
           <w:szCs w:val="24"/>
         </w:rPr>
-        <w:t>Single Responsibility Principle (SRP): cada clase tendrá una única responsabilidad.</w:t>
+        <w:t xml:space="preserve">Single </w:t>
+      </w:r>
+      <w:proofErr w:type="spellStart"/>
+      <w:r>
+        <w:rPr>
+          <w:rFonts w:ascii="Times New Roman" w:hAnsi="Times New Roman" w:cs="Times New Roman"/>
+          <w:sz w:val="24"/>
+          <w:szCs w:val="24"/>
+        </w:rPr>
+        <w:t>Responsibility</w:t>
+      </w:r>
+      <w:proofErr w:type="spellEnd"/>
+      <w:r>
+        <w:rPr>
+          <w:rFonts w:ascii="Times New Roman" w:hAnsi="Times New Roman" w:cs="Times New Roman"/>
+          <w:sz w:val="24"/>
+          <w:szCs w:val="24"/>
+        </w:rPr>
+        <w:t xml:space="preserve"> </w:t>
+      </w:r>
+      <w:proofErr w:type="spellStart"/>
+      <w:r>
+        <w:rPr>
+          <w:rFonts w:ascii="Times New Roman" w:hAnsi="Times New Roman" w:cs="Times New Roman"/>
+          <w:sz w:val="24"/>
+          <w:szCs w:val="24"/>
+        </w:rPr>
+        <w:t>Principle</w:t>
+      </w:r>
+      <w:proofErr w:type="spellEnd"/>
+      <w:r>
+        <w:rPr>
+          <w:rFonts w:ascii="Times New Roman" w:hAnsi="Times New Roman" w:cs="Times New Roman"/>
+          <w:sz w:val="24"/>
+          <w:szCs w:val="24"/>
+        </w:rPr>
+        <w:t xml:space="preserve"> (SRP): cada clase tendrá una única responsabilidad.</w:t>
       </w:r>
     </w:p>
     <w:p>
@@ -4125,7 +4144,43 @@
           <w:sz w:val="24"/>
           <w:szCs w:val="24"/>
         </w:rPr>
-        <w:t>Open/Closed Principle (OCP): los módulos estarán preparados para extender funcionalidades sin modificar código existente.</w:t>
+        <w:t>Open/</w:t>
+      </w:r>
+      <w:proofErr w:type="spellStart"/>
+      <w:r>
+        <w:rPr>
+          <w:rFonts w:ascii="Times New Roman" w:hAnsi="Times New Roman" w:cs="Times New Roman"/>
+          <w:sz w:val="24"/>
+          <w:szCs w:val="24"/>
+        </w:rPr>
+        <w:t>Closed</w:t>
+      </w:r>
+      <w:proofErr w:type="spellEnd"/>
+      <w:r>
+        <w:rPr>
+          <w:rFonts w:ascii="Times New Roman" w:hAnsi="Times New Roman" w:cs="Times New Roman"/>
+          <w:sz w:val="24"/>
+          <w:szCs w:val="24"/>
+        </w:rPr>
+        <w:t xml:space="preserve"> </w:t>
+      </w:r>
+      <w:proofErr w:type="spellStart"/>
+      <w:r>
+        <w:rPr>
+          <w:rFonts w:ascii="Times New Roman" w:hAnsi="Times New Roman" w:cs="Times New Roman"/>
+          <w:sz w:val="24"/>
+          <w:szCs w:val="24"/>
+        </w:rPr>
+        <w:t>Principle</w:t>
+      </w:r>
+      <w:proofErr w:type="spellEnd"/>
+      <w:r>
+        <w:rPr>
+          <w:rFonts w:ascii="Times New Roman" w:hAnsi="Times New Roman" w:cs="Times New Roman"/>
+          <w:sz w:val="24"/>
+          <w:szCs w:val="24"/>
+        </w:rPr>
+        <w:t xml:space="preserve"> (OCP): los módulos estarán preparados para extender funcionalidades sin modificar código existente.</w:t>
       </w:r>
     </w:p>
     <w:p>
@@ -4142,13 +4197,59 @@
           <w:szCs w:val="24"/>
         </w:rPr>
       </w:pPr>
-      <w:r>
-        <w:rPr>
-          <w:rFonts w:ascii="Times New Roman" w:hAnsi="Times New Roman" w:cs="Times New Roman"/>
-          <w:sz w:val="24"/>
-          <w:szCs w:val="24"/>
-        </w:rPr>
-        <w:t>Dependency Inversion Principle (DIP): se utilizarán interfaces para desacoplar servicios y repositorios.</w:t>
+      <w:proofErr w:type="spellStart"/>
+      <w:r>
+        <w:rPr>
+          <w:rFonts w:ascii="Times New Roman" w:hAnsi="Times New Roman" w:cs="Times New Roman"/>
+          <w:sz w:val="24"/>
+          <w:szCs w:val="24"/>
+        </w:rPr>
+        <w:t>Dependency</w:t>
+      </w:r>
+      <w:proofErr w:type="spellEnd"/>
+      <w:r>
+        <w:rPr>
+          <w:rFonts w:ascii="Times New Roman" w:hAnsi="Times New Roman" w:cs="Times New Roman"/>
+          <w:sz w:val="24"/>
+          <w:szCs w:val="24"/>
+        </w:rPr>
+        <w:t xml:space="preserve"> </w:t>
+      </w:r>
+      <w:proofErr w:type="spellStart"/>
+      <w:r>
+        <w:rPr>
+          <w:rFonts w:ascii="Times New Roman" w:hAnsi="Times New Roman" w:cs="Times New Roman"/>
+          <w:sz w:val="24"/>
+          <w:szCs w:val="24"/>
+        </w:rPr>
+        <w:t>Inversion</w:t>
+      </w:r>
+      <w:proofErr w:type="spellEnd"/>
+      <w:r>
+        <w:rPr>
+          <w:rFonts w:ascii="Times New Roman" w:hAnsi="Times New Roman" w:cs="Times New Roman"/>
+          <w:sz w:val="24"/>
+          <w:szCs w:val="24"/>
+        </w:rPr>
+        <w:t xml:space="preserve"> </w:t>
+      </w:r>
+      <w:proofErr w:type="spellStart"/>
+      <w:r>
+        <w:rPr>
+          <w:rFonts w:ascii="Times New Roman" w:hAnsi="Times New Roman" w:cs="Times New Roman"/>
+          <w:sz w:val="24"/>
+          <w:szCs w:val="24"/>
+        </w:rPr>
+        <w:t>Principle</w:t>
+      </w:r>
+      <w:proofErr w:type="spellEnd"/>
+      <w:r>
+        <w:rPr>
+          <w:rFonts w:ascii="Times New Roman" w:hAnsi="Times New Roman" w:cs="Times New Roman"/>
+          <w:sz w:val="24"/>
+          <w:szCs w:val="24"/>
+        </w:rPr>
+        <w:t xml:space="preserve"> (DIP): se utilizarán interfaces para desacoplar servicios y repositorios.</w:t>
       </w:r>
     </w:p>
     <w:p>
@@ -4196,7 +4297,25 @@
           <w:sz w:val="24"/>
           <w:szCs w:val="24"/>
         </w:rPr>
-        <w:t xml:space="preserve"> sistema implementará patrones de diseño GoF para mejorar la organización y reutilización del código.</w:t>
+        <w:t xml:space="preserve"> sistema implementará patrones de diseño </w:t>
+      </w:r>
+      <w:proofErr w:type="spellStart"/>
+      <w:r>
+        <w:rPr>
+          <w:rFonts w:ascii="Times New Roman" w:hAnsi="Times New Roman" w:cs="Times New Roman"/>
+          <w:sz w:val="24"/>
+          <w:szCs w:val="24"/>
+        </w:rPr>
+        <w:t>GoF</w:t>
+      </w:r>
+      <w:proofErr w:type="spellEnd"/>
+      <w:r>
+        <w:rPr>
+          <w:rFonts w:ascii="Times New Roman" w:hAnsi="Times New Roman" w:cs="Times New Roman"/>
+          <w:sz w:val="24"/>
+          <w:szCs w:val="24"/>
+        </w:rPr>
+        <w:t xml:space="preserve"> para mejorar la organización y reutilización del código.</w:t>
       </w:r>
     </w:p>
     <w:p>
@@ -4213,14 +4332,34 @@
           <w:szCs w:val="24"/>
         </w:rPr>
       </w:pPr>
-      <w:r>
-        <w:rPr>
-          <w:rFonts w:ascii="Times New Roman" w:hAnsi="Times New Roman" w:cs="Times New Roman"/>
-          <w:sz w:val="24"/>
-          <w:szCs w:val="24"/>
-        </w:rPr>
-        <w:t>Repository Pattern</w:t>
-      </w:r>
+      <w:proofErr w:type="spellStart"/>
+      <w:r>
+        <w:rPr>
+          <w:rFonts w:ascii="Times New Roman" w:hAnsi="Times New Roman" w:cs="Times New Roman"/>
+          <w:sz w:val="24"/>
+          <w:szCs w:val="24"/>
+        </w:rPr>
+        <w:t>Repository</w:t>
+      </w:r>
+      <w:proofErr w:type="spellEnd"/>
+      <w:r>
+        <w:rPr>
+          <w:rFonts w:ascii="Times New Roman" w:hAnsi="Times New Roman" w:cs="Times New Roman"/>
+          <w:sz w:val="24"/>
+          <w:szCs w:val="24"/>
+        </w:rPr>
+        <w:t xml:space="preserve"> </w:t>
+      </w:r>
+      <w:proofErr w:type="spellStart"/>
+      <w:r>
+        <w:rPr>
+          <w:rFonts w:ascii="Times New Roman" w:hAnsi="Times New Roman" w:cs="Times New Roman"/>
+          <w:sz w:val="24"/>
+          <w:szCs w:val="24"/>
+        </w:rPr>
+        <w:t>Pattern</w:t>
+      </w:r>
+      <w:proofErr w:type="spellEnd"/>
       <w:r>
         <w:rPr>
           <w:rFonts w:ascii="Times New Roman" w:hAnsi="Times New Roman" w:cs="Times New Roman"/>
@@ -4252,14 +4391,34 @@
           <w:szCs w:val="24"/>
         </w:rPr>
       </w:pPr>
-      <w:r>
-        <w:rPr>
-          <w:rFonts w:ascii="Times New Roman" w:hAnsi="Times New Roman" w:cs="Times New Roman"/>
-          <w:sz w:val="24"/>
-          <w:szCs w:val="24"/>
-        </w:rPr>
-        <w:t>Singleton Pattern</w:t>
-      </w:r>
+      <w:proofErr w:type="spellStart"/>
+      <w:r>
+        <w:rPr>
+          <w:rFonts w:ascii="Times New Roman" w:hAnsi="Times New Roman" w:cs="Times New Roman"/>
+          <w:sz w:val="24"/>
+          <w:szCs w:val="24"/>
+        </w:rPr>
+        <w:t>Singleton</w:t>
+      </w:r>
+      <w:proofErr w:type="spellEnd"/>
+      <w:r>
+        <w:rPr>
+          <w:rFonts w:ascii="Times New Roman" w:hAnsi="Times New Roman" w:cs="Times New Roman"/>
+          <w:sz w:val="24"/>
+          <w:szCs w:val="24"/>
+        </w:rPr>
+        <w:t xml:space="preserve"> </w:t>
+      </w:r>
+      <w:proofErr w:type="spellStart"/>
+      <w:r>
+        <w:rPr>
+          <w:rFonts w:ascii="Times New Roman" w:hAnsi="Times New Roman" w:cs="Times New Roman"/>
+          <w:sz w:val="24"/>
+          <w:szCs w:val="24"/>
+        </w:rPr>
+        <w:t>Pattern</w:t>
+      </w:r>
+      <w:proofErr w:type="spellEnd"/>
       <w:r>
         <w:rPr>
           <w:rFonts w:ascii="Times New Roman" w:hAnsi="Times New Roman" w:cs="Times New Roman"/>
@@ -4291,14 +4450,34 @@
           <w:szCs w:val="24"/>
         </w:rPr>
       </w:pPr>
-      <w:r>
-        <w:rPr>
-          <w:rFonts w:ascii="Times New Roman" w:hAnsi="Times New Roman" w:cs="Times New Roman"/>
-          <w:sz w:val="24"/>
-          <w:szCs w:val="24"/>
-        </w:rPr>
-        <w:t>Strategy Pattern</w:t>
-      </w:r>
+      <w:proofErr w:type="spellStart"/>
+      <w:r>
+        <w:rPr>
+          <w:rFonts w:ascii="Times New Roman" w:hAnsi="Times New Roman" w:cs="Times New Roman"/>
+          <w:sz w:val="24"/>
+          <w:szCs w:val="24"/>
+        </w:rPr>
+        <w:t>Strategy</w:t>
+      </w:r>
+      <w:proofErr w:type="spellEnd"/>
+      <w:r>
+        <w:rPr>
+          <w:rFonts w:ascii="Times New Roman" w:hAnsi="Times New Roman" w:cs="Times New Roman"/>
+          <w:sz w:val="24"/>
+          <w:szCs w:val="24"/>
+        </w:rPr>
+        <w:t xml:space="preserve"> </w:t>
+      </w:r>
+      <w:proofErr w:type="spellStart"/>
+      <w:r>
+        <w:rPr>
+          <w:rFonts w:ascii="Times New Roman" w:hAnsi="Times New Roman" w:cs="Times New Roman"/>
+          <w:sz w:val="24"/>
+          <w:szCs w:val="24"/>
+        </w:rPr>
+        <w:t>Pattern</w:t>
+      </w:r>
+      <w:proofErr w:type="spellEnd"/>
       <w:r>
         <w:rPr>
           <w:rFonts w:ascii="Times New Roman" w:hAnsi="Times New Roman" w:cs="Times New Roman"/>
@@ -4469,6 +4648,111 @@
         <w:ind w:left="360"/>
         <w:rPr>
           <w:rFonts w:ascii="Times New Roman" w:hAnsi="Times New Roman" w:cs="Times New Roman"/>
+          <w:sz w:val="24"/>
+          <w:szCs w:val="24"/>
+        </w:rPr>
+      </w:pPr>
+    </w:p>
+    <w:p>
+      <w:pPr>
+        <w:pStyle w:val="Prrafodelista"/>
+        <w:numPr>
+          <w:ilvl w:val="0"/>
+          <w:numId w:val="20"/>
+        </w:numPr>
+        <w:spacing w:line="480" w:lineRule="auto"/>
+        <w:rPr>
+          <w:rFonts w:ascii="Times New Roman" w:hAnsi="Times New Roman" w:cs="Times New Roman"/>
+          <w:b/>
+          <w:bCs/>
+          <w:sz w:val="24"/>
+          <w:szCs w:val="24"/>
+        </w:rPr>
+      </w:pPr>
+      <w:r>
+        <w:rPr>
+          <w:rFonts w:ascii="Times New Roman" w:hAnsi="Times New Roman" w:cs="Times New Roman"/>
+          <w:b/>
+          <w:bCs/>
+          <w:sz w:val="24"/>
+          <w:szCs w:val="24"/>
+        </w:rPr>
+        <w:drawing>
+          <wp:anchor distT="0" distB="0" distL="114300" distR="114300" simplePos="0" relativeHeight="251658240" behindDoc="0" locked="0" layoutInCell="1" allowOverlap="1" wp14:anchorId="73CD4B2F" wp14:editId="271AA37C">
+            <wp:simplePos x="0" y="0"/>
+            <wp:positionH relativeFrom="margin">
+              <wp:align>left</wp:align>
+            </wp:positionH>
+            <wp:positionV relativeFrom="margin">
+              <wp:posOffset>1836420</wp:posOffset>
+            </wp:positionV>
+            <wp:extent cx="6233795" cy="4786630"/>
+            <wp:effectExtent l="0" t="0" r="0" b="0"/>
+            <wp:wrapSquare wrapText="bothSides"/>
+            <wp:docPr id="1" name="Imagen 1"/>
+            <wp:cNvGraphicFramePr>
+              <a:graphicFrameLocks xmlns:a="http://schemas.openxmlformats.org/drawingml/2006/main" noChangeAspect="1"/>
+            </wp:cNvGraphicFramePr>
+            <a:graphic xmlns:a="http://schemas.openxmlformats.org/drawingml/2006/main">
+              <a:graphicData uri="http://schemas.openxmlformats.org/drawingml/2006/picture">
+                <pic:pic xmlns:pic="http://schemas.openxmlformats.org/drawingml/2006/picture">
+                  <pic:nvPicPr>
+                    <pic:cNvPr id="1" name=""/>
+                    <pic:cNvPicPr/>
+                  </pic:nvPicPr>
+                  <pic:blipFill>
+                    <a:blip r:embed="rId5">
+                      <a:extLst>
+                        <a:ext uri="{28A0092B-C50C-407E-A947-70E740481C1C}">
+                          <a14:useLocalDpi xmlns:a14="http://schemas.microsoft.com/office/drawing/2010/main" val="0"/>
+                        </a:ext>
+                      </a:extLst>
+                    </a:blip>
+                    <a:stretch>
+                      <a:fillRect/>
+                    </a:stretch>
+                  </pic:blipFill>
+                  <pic:spPr>
+                    <a:xfrm>
+                      <a:off x="0" y="0"/>
+                      <a:ext cx="6233795" cy="4786630"/>
+                    </a:xfrm>
+                    <a:prstGeom prst="rect">
+                      <a:avLst/>
+                    </a:prstGeom>
+                  </pic:spPr>
+                </pic:pic>
+              </a:graphicData>
+            </a:graphic>
+            <wp14:sizeRelH relativeFrom="margin">
+              <wp14:pctWidth>0</wp14:pctWidth>
+            </wp14:sizeRelH>
+            <wp14:sizeRelV relativeFrom="margin">
+              <wp14:pctHeight>0</wp14:pctHeight>
+            </wp14:sizeRelV>
+          </wp:anchor>
+        </w:drawing>
+      </w:r>
+      <w:r>
+        <w:rPr>
+          <w:rFonts w:ascii="Times New Roman" w:hAnsi="Times New Roman" w:cs="Times New Roman"/>
+          <w:b/>
+          <w:bCs/>
+          <w:sz w:val="24"/>
+          <w:szCs w:val="24"/>
+        </w:rPr>
+        <w:t>Diagrama modelo entidad relación</w:t>
+      </w:r>
+    </w:p>
+    <w:p>
+      <w:pPr>
+        <w:pStyle w:val="Prrafodelista"/>
+        <w:spacing w:line="480" w:lineRule="auto"/>
+        <w:ind w:left="360"/>
+        <w:rPr>
+          <w:rFonts w:ascii="Times New Roman" w:hAnsi="Times New Roman" w:cs="Times New Roman"/>
+          <w:b/>
+          <w:bCs/>
           <w:sz w:val="24"/>
           <w:szCs w:val="24"/>
         </w:rPr>
@@ -8113,6 +8397,7 @@
   <w:style w:type="character" w:default="1" w:styleId="Fuentedeprrafopredeter">
     <w:name w:val="Default Paragraph Font"/>
     <w:uiPriority w:val="1"/>
+    <w:semiHidden/>
     <w:unhideWhenUsed/>
   </w:style>
   <w:style w:type="table" w:default="1" w:styleId="Tablanormal">

</xml_diff>

<commit_message>
docs: actualizacion de la documentacion. Se agrega el diagrama de clases
</commit_message>
<xml_diff>
--- a/docs/Documentacion.docx
+++ b/docs/Documentacion.docx
@@ -1,6 +1,6 @@
 
 <file path=word/document.xml><?xml version="1.0" encoding="utf-8"?>
-<w:document xmlns:wpc="http://schemas.microsoft.com/office/word/2010/wordprocessingCanvas" xmlns:cx="http://schemas.microsoft.com/office/drawing/2014/chartex" xmlns:cx1="http://schemas.microsoft.com/office/drawing/2015/9/8/chartex" xmlns:cx2="http://schemas.microsoft.com/office/drawing/2015/10/21/chartex" xmlns:cx3="http://schemas.microsoft.com/office/drawing/2016/5/9/chartex" xmlns:cx4="http://schemas.microsoft.com/office/drawing/2016/5/10/chartex" xmlns:cx5="http://schemas.microsoft.com/office/drawing/2016/5/11/chartex" xmlns:cx6="http://schemas.microsoft.com/office/drawing/2016/5/12/chartex" xmlns:cx7="http://schemas.microsoft.com/office/drawing/2016/5/13/chartex" xmlns:cx8="http://schemas.microsoft.com/office/drawing/2016/5/14/chartex" xmlns:mc="http://schemas.openxmlformats.org/markup-compatibility/2006" xmlns:aink="http://schemas.microsoft.com/office/drawing/2016/ink" xmlns:am3d="http://schemas.microsoft.com/office/drawing/2017/model3d" xmlns:o="urn:schemas-microsoft-com:office:office" xmlns:r="http://schemas.openxmlformats.org/officeDocument/2006/relationships" xmlns:m="http://schemas.openxmlformats.org/officeDocument/2006/math" xmlns:v="urn:schemas-microsoft-com:vml" xmlns:wp14="http://schemas.microsoft.com/office/word/2010/wordprocessingDrawing" xmlns:wp="http://schemas.openxmlformats.org/drawingml/2006/wordprocessingDrawing" xmlns:w10="urn:schemas-microsoft-com:office:word" xmlns:w="http://schemas.openxmlformats.org/wordprocessingml/2006/main" xmlns:w14="http://schemas.microsoft.com/office/word/2010/wordml" xmlns:w15="http://schemas.microsoft.com/office/word/2012/wordml" xmlns:w16cex="http://schemas.microsoft.com/office/word/2018/wordml/cex" xmlns:w16cid="http://schemas.microsoft.com/office/word/2016/wordml/cid" xmlns:w16="http://schemas.microsoft.com/office/word/2018/wordml" xmlns:w16sdtdh="http://schemas.microsoft.com/office/word/2020/wordml/sdtdatahash" xmlns:w16se="http://schemas.microsoft.com/office/word/2015/wordml/symex" xmlns:wpg="http://schemas.microsoft.com/office/word/2010/wordprocessingGroup" xmlns:wpi="http://schemas.microsoft.com/office/word/2010/wordprocessingInk" xmlns:wne="http://schemas.microsoft.com/office/word/2006/wordml" xmlns:wps="http://schemas.microsoft.com/office/word/2010/wordprocessingShape" mc:Ignorable="w14 w15 w16se w16cid w16 w16cex w16sdtdh wp14">
+<w:document xmlns:wpc="http://schemas.microsoft.com/office/word/2010/wordprocessingCanvas" xmlns:cx="http://schemas.microsoft.com/office/drawing/2014/chartex" xmlns:cx1="http://schemas.microsoft.com/office/drawing/2015/9/8/chartex" xmlns:cx2="http://schemas.microsoft.com/office/drawing/2015/10/21/chartex" xmlns:cx3="http://schemas.microsoft.com/office/drawing/2016/5/9/chartex" xmlns:cx4="http://schemas.microsoft.com/office/drawing/2016/5/10/chartex" xmlns:cx5="http://schemas.microsoft.com/office/drawing/2016/5/11/chartex" xmlns:cx6="http://schemas.microsoft.com/office/drawing/2016/5/12/chartex" xmlns:cx7="http://schemas.microsoft.com/office/drawing/2016/5/13/chartex" xmlns:cx8="http://schemas.microsoft.com/office/drawing/2016/5/14/chartex" xmlns:mc="http://schemas.openxmlformats.org/markup-compatibility/2006" xmlns:aink="http://schemas.microsoft.com/office/drawing/2016/ink" xmlns:am3d="http://schemas.microsoft.com/office/drawing/2017/model3d" xmlns:o="urn:schemas-microsoft-com:office:office" xmlns:r="http://schemas.openxmlformats.org/officeDocument/2006/relationships" xmlns:m="http://schemas.openxmlformats.org/officeDocument/2006/math" xmlns:v="urn:schemas-microsoft-com:vml" xmlns:wp14="http://schemas.microsoft.com/office/word/2010/wordprocessingDrawing" xmlns:wp="http://schemas.openxmlformats.org/drawingml/2006/wordprocessingDrawing" xmlns:w10="urn:schemas-microsoft-com:office:word" xmlns:w="http://schemas.openxmlformats.org/wordprocessingml/2006/main" xmlns:w14="http://schemas.microsoft.com/office/word/2010/wordml" xmlns:w15="http://schemas.microsoft.com/office/word/2012/wordml" xmlns:w16cex="http://schemas.microsoft.com/office/word/2018/wordml/cex" xmlns:w16cid="http://schemas.microsoft.com/office/word/2016/wordml/cid" xmlns:w16="http://schemas.microsoft.com/office/word/2018/wordml" xmlns:w16sdtdh="http://schemas.microsoft.com/office/word/2020/wordml/sdtdatahash" xmlns:w16se="http://schemas.microsoft.com/office/word/2015/wordml/symex" xmlns:wpg="http://schemas.microsoft.com/office/word/2010/wordprocessingGroup" xmlns:wpi="http://schemas.microsoft.com/office/word/2010/wordprocessingInk" xmlns:wne="http://schemas.microsoft.com/office/word/2006/wordml" xmlns:wps="http://schemas.microsoft.com/office/word/2010/wordprocessingShape" xmlns:a="http://schemas.openxmlformats.org/drawingml/2006/main" xmlns:pic="http://schemas.openxmlformats.org/drawingml/2006/picture" xmlns:a14="http://schemas.microsoft.com/office/drawing/2010/main" mc:Ignorable="w14 w15 w16se w16cid w16 w16cex w16sdtdh wp14">
   <w:body>
     <w:p>
       <w:pPr>
@@ -1179,7 +1179,7 @@
           <w:szCs w:val="24"/>
         </w:rPr>
       </w:pPr>
-      <w:bookmarkStart w:id="0" w:name="_Hlk229578375"/>
+      <w:bookmarkStart w:name="_Hlk229578375" w:id="0"/>
       <w:r>
         <w:rPr>
           <w:rFonts w:ascii="Times New Roman" w:hAnsi="Times New Roman" w:cs="Times New Roman"/>
@@ -4736,8 +4736,8 @@
       <w:r>
         <w:rPr>
           <w:rFonts w:ascii="Times New Roman" w:hAnsi="Times New Roman" w:cs="Times New Roman"/>
-          <w:b/>
-          <w:bCs/>
+          <w:b w:val="1"/>
+          <w:bCs w:val="1"/>
           <w:sz w:val="24"/>
           <w:szCs w:val="24"/>
         </w:rPr>
@@ -4751,344 +4751,155 @@
         <w:ind w:left="360"/>
         <w:rPr>
           <w:rFonts w:ascii="Times New Roman" w:hAnsi="Times New Roman" w:cs="Times New Roman"/>
-          <w:b/>
-          <w:bCs/>
-          <w:sz w:val="24"/>
-          <w:szCs w:val="24"/>
-        </w:rPr>
-      </w:pPr>
-    </w:p>
-    <w:p>
-      <w:pPr>
-        <w:pStyle w:val="Prrafodelista"/>
-        <w:spacing w:line="480" w:lineRule="auto"/>
-        <w:rPr>
-          <w:rFonts w:ascii="Times New Roman" w:hAnsi="Times New Roman" w:cs="Times New Roman"/>
-          <w:b/>
-          <w:bCs/>
-          <w:sz w:val="24"/>
-          <w:szCs w:val="24"/>
-        </w:rPr>
-      </w:pPr>
-    </w:p>
-    <w:p>
-      <w:pPr>
-        <w:pStyle w:val="Prrafodelista"/>
-        <w:spacing w:line="480" w:lineRule="auto"/>
-        <w:rPr>
-          <w:rFonts w:ascii="Times New Roman" w:hAnsi="Times New Roman" w:cs="Times New Roman"/>
-          <w:sz w:val="24"/>
-          <w:szCs w:val="24"/>
-        </w:rPr>
-      </w:pPr>
-    </w:p>
-    <w:p>
-      <w:pPr>
-        <w:pStyle w:val="Prrafodelista"/>
-        <w:spacing w:line="480" w:lineRule="auto"/>
-        <w:rPr>
-          <w:rFonts w:ascii="Times New Roman" w:hAnsi="Times New Roman" w:cs="Times New Roman"/>
-          <w:sz w:val="24"/>
-          <w:szCs w:val="24"/>
-        </w:rPr>
-      </w:pPr>
-    </w:p>
-    <w:p>
-      <w:pPr>
-        <w:pStyle w:val="Prrafodelista"/>
-        <w:spacing w:line="480" w:lineRule="auto"/>
-        <w:rPr>
-          <w:rFonts w:ascii="Times New Roman" w:hAnsi="Times New Roman" w:cs="Times New Roman"/>
-          <w:sz w:val="24"/>
-          <w:szCs w:val="24"/>
-        </w:rPr>
-      </w:pPr>
-    </w:p>
-    <w:p>
-      <w:pPr>
-        <w:pStyle w:val="Prrafodelista"/>
-        <w:spacing w:line="480" w:lineRule="auto"/>
-        <w:rPr>
-          <w:rFonts w:ascii="Times New Roman" w:hAnsi="Times New Roman" w:cs="Times New Roman"/>
-          <w:sz w:val="24"/>
-          <w:szCs w:val="24"/>
-        </w:rPr>
-      </w:pPr>
-    </w:p>
-    <w:p>
-      <w:pPr>
-        <w:pStyle w:val="Prrafodelista"/>
-        <w:spacing w:line="480" w:lineRule="auto"/>
-        <w:rPr>
-          <w:rFonts w:ascii="Times New Roman" w:hAnsi="Times New Roman" w:cs="Times New Roman"/>
-          <w:sz w:val="24"/>
-          <w:szCs w:val="24"/>
-        </w:rPr>
-      </w:pPr>
-    </w:p>
-    <w:p>
-      <w:pPr>
-        <w:pStyle w:val="Prrafodelista"/>
-        <w:spacing w:line="480" w:lineRule="auto"/>
-        <w:rPr>
-          <w:rFonts w:ascii="Times New Roman" w:hAnsi="Times New Roman" w:cs="Times New Roman"/>
-          <w:b/>
-          <w:bCs/>
-          <w:sz w:val="24"/>
-          <w:szCs w:val="24"/>
-        </w:rPr>
-      </w:pPr>
-    </w:p>
-    <w:p>
-      <w:pPr>
-        <w:pStyle w:val="Prrafodelista"/>
-        <w:spacing w:line="480" w:lineRule="auto"/>
-        <w:rPr>
-          <w:rFonts w:ascii="Times New Roman" w:hAnsi="Times New Roman" w:cs="Times New Roman"/>
-          <w:b/>
-          <w:bCs/>
-          <w:sz w:val="24"/>
-          <w:szCs w:val="24"/>
-        </w:rPr>
-      </w:pPr>
-    </w:p>
-    <w:p>
-      <w:pPr>
-        <w:pStyle w:val="Prrafodelista"/>
-        <w:spacing w:line="480" w:lineRule="auto"/>
-        <w:rPr>
-          <w:rFonts w:ascii="Times New Roman" w:hAnsi="Times New Roman" w:cs="Times New Roman"/>
-          <w:sz w:val="24"/>
-          <w:szCs w:val="24"/>
-        </w:rPr>
-      </w:pPr>
-    </w:p>
-    <w:p>
-      <w:pPr>
-        <w:spacing w:line="480" w:lineRule="auto"/>
-        <w:rPr>
-          <w:rFonts w:ascii="Times New Roman" w:hAnsi="Times New Roman" w:cs="Times New Roman"/>
-          <w:sz w:val="24"/>
-          <w:szCs w:val="24"/>
-        </w:rPr>
-      </w:pPr>
-    </w:p>
-    <w:p>
-      <w:pPr>
-        <w:rPr>
-          <w:rFonts w:ascii="Times New Roman" w:hAnsi="Times New Roman" w:cs="Times New Roman"/>
-          <w:sz w:val="24"/>
-          <w:szCs w:val="24"/>
-        </w:rPr>
-      </w:pPr>
-    </w:p>
-    <w:p>
-      <w:pPr>
-        <w:rPr>
-          <w:rFonts w:ascii="Times New Roman" w:hAnsi="Times New Roman" w:cs="Times New Roman"/>
-          <w:sz w:val="24"/>
-          <w:szCs w:val="24"/>
-        </w:rPr>
-      </w:pPr>
-    </w:p>
-    <w:p>
-      <w:pPr>
-        <w:rPr>
-          <w:rFonts w:ascii="Times New Roman" w:hAnsi="Times New Roman" w:cs="Times New Roman"/>
-          <w:sz w:val="24"/>
-          <w:szCs w:val="24"/>
-        </w:rPr>
-      </w:pPr>
-    </w:p>
-    <w:p>
-      <w:pPr>
-        <w:rPr>
-          <w:rFonts w:ascii="Times New Roman" w:hAnsi="Times New Roman" w:cs="Times New Roman"/>
-          <w:sz w:val="24"/>
-          <w:szCs w:val="24"/>
-        </w:rPr>
-      </w:pPr>
-    </w:p>
-    <w:p>
-      <w:pPr>
-        <w:rPr>
-          <w:rFonts w:ascii="Times New Roman" w:hAnsi="Times New Roman" w:cs="Times New Roman"/>
-          <w:sz w:val="24"/>
-          <w:szCs w:val="24"/>
-        </w:rPr>
-      </w:pPr>
-    </w:p>
-    <w:p>
-      <w:pPr>
-        <w:rPr>
-          <w:rFonts w:ascii="Times New Roman" w:hAnsi="Times New Roman" w:cs="Times New Roman"/>
-          <w:sz w:val="24"/>
-          <w:szCs w:val="24"/>
-        </w:rPr>
-      </w:pPr>
-    </w:p>
-    <w:p>
-      <w:pPr>
-        <w:rPr>
-          <w:rFonts w:ascii="Times New Roman" w:hAnsi="Times New Roman" w:cs="Times New Roman"/>
-          <w:sz w:val="24"/>
-          <w:szCs w:val="24"/>
-        </w:rPr>
-      </w:pPr>
-    </w:p>
-    <w:p>
-      <w:pPr>
-        <w:rPr>
-          <w:rFonts w:ascii="Times New Roman" w:hAnsi="Times New Roman" w:cs="Times New Roman"/>
-          <w:sz w:val="24"/>
-          <w:szCs w:val="24"/>
-        </w:rPr>
-      </w:pPr>
-    </w:p>
-    <w:p>
-      <w:pPr>
-        <w:rPr>
-          <w:rFonts w:ascii="Times New Roman" w:hAnsi="Times New Roman" w:cs="Times New Roman"/>
-          <w:sz w:val="24"/>
-          <w:szCs w:val="24"/>
-        </w:rPr>
-      </w:pPr>
-    </w:p>
-    <w:p>
-      <w:pPr>
-        <w:rPr>
-          <w:rFonts w:ascii="Times New Roman" w:hAnsi="Times New Roman" w:cs="Times New Roman"/>
-          <w:sz w:val="24"/>
-          <w:szCs w:val="24"/>
-        </w:rPr>
-      </w:pPr>
-    </w:p>
-    <w:p>
-      <w:pPr>
-        <w:rPr>
-          <w:rFonts w:ascii="Times New Roman" w:hAnsi="Times New Roman" w:cs="Times New Roman"/>
-          <w:sz w:val="24"/>
-          <w:szCs w:val="24"/>
-        </w:rPr>
-      </w:pPr>
-    </w:p>
-    <w:p>
-      <w:pPr>
-        <w:pStyle w:val="Prrafodelista"/>
-        <w:ind w:left="0"/>
-        <w:rPr>
-          <w:rFonts w:ascii="Times New Roman" w:hAnsi="Times New Roman" w:cs="Times New Roman"/>
-          <w:b/>
-          <w:bCs/>
-          <w:sz w:val="24"/>
-          <w:szCs w:val="24"/>
-        </w:rPr>
-      </w:pPr>
-    </w:p>
-    <w:p>
-      <w:pPr>
-        <w:pStyle w:val="Prrafodelista"/>
-        <w:ind w:left="0"/>
-        <w:rPr>
-          <w:rFonts w:ascii="Times New Roman" w:hAnsi="Times New Roman" w:cs="Times New Roman"/>
-          <w:b/>
-          <w:bCs/>
-          <w:sz w:val="24"/>
-          <w:szCs w:val="24"/>
-        </w:rPr>
-      </w:pPr>
-    </w:p>
-    <w:p>
-      <w:pPr>
-        <w:pStyle w:val="Prrafodelista"/>
-        <w:ind w:left="0"/>
-        <w:rPr>
-          <w:rFonts w:ascii="Times New Roman" w:hAnsi="Times New Roman" w:cs="Times New Roman"/>
-          <w:b/>
-          <w:bCs/>
-          <w:sz w:val="24"/>
-          <w:szCs w:val="24"/>
-        </w:rPr>
-      </w:pPr>
-    </w:p>
-    <w:p>
-      <w:pPr>
-        <w:pStyle w:val="Prrafodelista"/>
-        <w:ind w:left="0"/>
-        <w:rPr>
-          <w:rFonts w:ascii="Times New Roman" w:hAnsi="Times New Roman" w:cs="Times New Roman"/>
-          <w:b/>
-          <w:bCs/>
-          <w:sz w:val="24"/>
-          <w:szCs w:val="24"/>
-        </w:rPr>
-      </w:pPr>
-    </w:p>
-    <w:p>
-      <w:pPr>
-        <w:pStyle w:val="Prrafodelista"/>
-        <w:ind w:left="0"/>
-        <w:rPr>
-          <w:rFonts w:ascii="Times New Roman" w:hAnsi="Times New Roman" w:cs="Times New Roman"/>
-          <w:b/>
-          <w:bCs/>
-          <w:sz w:val="24"/>
-          <w:szCs w:val="24"/>
-        </w:rPr>
-      </w:pPr>
-    </w:p>
-    <w:p>
-      <w:pPr>
-        <w:pStyle w:val="Prrafodelista"/>
-        <w:rPr>
-          <w:rFonts w:ascii="Times New Roman" w:hAnsi="Times New Roman" w:cs="Times New Roman"/>
-          <w:b/>
-          <w:bCs/>
-          <w:sz w:val="24"/>
-          <w:szCs w:val="24"/>
-        </w:rPr>
-      </w:pPr>
-    </w:p>
-    <w:p>
-      <w:pPr>
-        <w:pStyle w:val="Prrafodelista"/>
-        <w:rPr>
-          <w:rFonts w:ascii="Times New Roman" w:hAnsi="Times New Roman" w:cs="Times New Roman"/>
-          <w:b/>
-          <w:bCs/>
-          <w:sz w:val="24"/>
-          <w:szCs w:val="24"/>
-        </w:rPr>
-      </w:pPr>
-    </w:p>
-    <w:p>
-      <w:pPr>
-        <w:pStyle w:val="Prrafodelista"/>
-        <w:ind w:left="0"/>
-        <w:rPr>
-          <w:rFonts w:ascii="Times New Roman" w:hAnsi="Times New Roman" w:cs="Times New Roman"/>
-          <w:b/>
-          <w:bCs/>
-          <w:sz w:val="24"/>
-          <w:szCs w:val="24"/>
-        </w:rPr>
-      </w:pPr>
-    </w:p>
-    <w:p>
-      <w:pPr>
-        <w:pStyle w:val="Prrafodelista"/>
-        <w:ind w:left="0"/>
-        <w:rPr>
-          <w:rFonts w:ascii="Times New Roman" w:hAnsi="Times New Roman" w:cs="Times New Roman"/>
-          <w:b/>
-          <w:bCs/>
-          <w:sz w:val="24"/>
-          <w:szCs w:val="24"/>
-        </w:rPr>
-      </w:pPr>
+          <w:b w:val="1"/>
+          <w:bCs w:val="1"/>
+          <w:sz w:val="24"/>
+          <w:szCs w:val="24"/>
+        </w:rPr>
+      </w:pPr>
+    </w:p>
+    <w:p>
+      <w:pPr>
+        <w:pStyle w:val="Prrafodelista"/>
+        <w:spacing w:line="480" w:lineRule="auto"/>
+        <w:ind w:left="360"/>
+        <w:rPr>
+          <w:rFonts w:ascii="Times New Roman" w:hAnsi="Times New Roman" w:cs="Times New Roman"/>
+          <w:b w:val="1"/>
+          <w:bCs w:val="1"/>
+          <w:sz w:val="24"/>
+          <w:szCs w:val="24"/>
+        </w:rPr>
+      </w:pPr>
+    </w:p>
+    <w:p>
+      <w:pPr>
+        <w:pStyle w:val="Prrafodelista"/>
+        <w:spacing w:line="480" w:lineRule="auto"/>
+        <w:ind w:left="360"/>
+        <w:rPr>
+          <w:rFonts w:ascii="Times New Roman" w:hAnsi="Times New Roman" w:cs="Times New Roman"/>
+          <w:b w:val="1"/>
+          <w:bCs w:val="1"/>
+          <w:sz w:val="24"/>
+          <w:szCs w:val="24"/>
+        </w:rPr>
+      </w:pPr>
+    </w:p>
+    <w:p>
+      <w:pPr>
+        <w:pStyle w:val="Prrafodelista"/>
+        <w:spacing w:line="480" w:lineRule="auto"/>
+        <w:ind w:left="360"/>
+        <w:rPr>
+          <w:rFonts w:ascii="Times New Roman" w:hAnsi="Times New Roman" w:cs="Times New Roman"/>
+          <w:b w:val="1"/>
+          <w:bCs w:val="1"/>
+          <w:sz w:val="24"/>
+          <w:szCs w:val="24"/>
+        </w:rPr>
+      </w:pPr>
+    </w:p>
+    <w:p>
+      <w:pPr>
+        <w:pStyle w:val="Prrafodelista"/>
+        <w:numPr>
+          <w:ilvl w:val="0"/>
+          <w:numId w:val="20"/>
+        </w:numPr>
+        <w:spacing w:line="480" w:lineRule="auto"/>
+        <w:rPr>
+          <w:rFonts w:ascii="Times New Roman" w:hAnsi="Times New Roman" w:cs="Times New Roman"/>
+          <w:b w:val="1"/>
+          <w:bCs w:val="1"/>
+          <w:sz w:val="24"/>
+          <w:szCs w:val="24"/>
+        </w:rPr>
+      </w:pPr>
+      <w:r>
+        <w:rPr>
+          <w:rFonts w:ascii="Times New Roman" w:hAnsi="Times New Roman" w:cs="Times New Roman"/>
+          <w:b w:val="1"/>
+          <w:bCs w:val="1"/>
+          <w:sz w:val="24"/>
+          <w:szCs w:val="24"/>
+        </w:rPr>
+        <w:t>Diagrama de clases</w:t>
+      </w:r>
+    </w:p>
+    <w:p>
+      <w:pPr>
+        <w:pStyle w:val="Prrafodelista"/>
+        <w:spacing w:line="480" w:lineRule="auto"/>
+        <w:ind w:left="360"/>
+        <w:rPr>
+          <w:rFonts w:ascii="Times New Roman" w:hAnsi="Times New Roman" w:cs="Times New Roman"/>
+          <w:b w:val="1"/>
+          <w:bCs w:val="1"/>
+          <w:sz w:val="24"/>
+          <w:szCs w:val="24"/>
+        </w:rPr>
+      </w:pPr>
+    </w:p>
+    <w:p>
+      <w:pPr>
+        <w:pStyle w:val="Prrafodelista"/>
+        <w:spacing w:line="480" w:lineRule="auto"/>
+        <w:ind w:left="360"/>
+        <w:rPr>
+          <w:rFonts w:ascii="Times New Roman" w:hAnsi="Times New Roman" w:cs="Times New Roman"/>
+          <w:b w:val="1"/>
+          <w:bCs w:val="1"/>
+          <w:sz w:val="24"/>
+          <w:szCs w:val="24"/>
+        </w:rPr>
+      </w:pPr>
+      <w:r>
+        <w:drawing>
+          <wp:inline wp14:editId="4387D791" wp14:anchorId="6009112A">
+            <wp:extent cx="5153025" cy="5943600"/>
+            <wp:effectExtent l="0" t="0" r="0" b="0"/>
+            <wp:docPr id="137021613" name="drawing"/>
+            <wp:cNvGraphicFramePr>
+              <a:graphicFrameLocks noChangeAspect="1"/>
+            </wp:cNvGraphicFramePr>
+            <a:graphic>
+              <a:graphicData xmlns:a="http://schemas.openxmlformats.org/drawingml/2006/main" uri="http://schemas.openxmlformats.org/drawingml/2006/picture">
+                <pic:pic xmlns:pic="http://schemas.openxmlformats.org/drawingml/2006/picture">
+                  <pic:nvPicPr>
+                    <pic:cNvPr id="137021613" name=""/>
+                    <pic:cNvPicPr/>
+                  </pic:nvPicPr>
+                  <pic:blipFill>
+                    <a:blip xmlns:r="http://schemas.openxmlformats.org/officeDocument/2006/relationships" r:embed="rId655722959">
+                      <a:extLst>
+                        <a:ext xmlns:a="http://schemas.openxmlformats.org/drawingml/2006/main" uri="{28A0092B-C50C-407E-A947-70E740481C1C}">
+                          <a14:useLocalDpi xmlns:a14="http://schemas.microsoft.com/office/drawing/2010/main" val="0"/>
+                        </a:ext>
+                      </a:extLst>
+                    </a:blip>
+                    <a:stretch>
+                      <a:fillRect/>
+                    </a:stretch>
+                  </pic:blipFill>
+                  <pic:spPr>
+                    <a:xfrm>
+                      <a:off x="0" y="0"/>
+                      <a:ext cx="5153025" cy="5943600"/>
+                    </a:xfrm>
+                    <a:prstGeom prst="rect">
+                      <a:avLst/>
+                    </a:prstGeom>
+                  </pic:spPr>
+                </pic:pic>
+              </a:graphicData>
+            </a:graphic>
+          </wp:inline>
+        </w:drawing>
+      </w:r>
     </w:p>
     <w:sectPr>
-      <w:pgSz w:w="12240" w:h="15840"/>
+      <w:pgSz w:w="12240" w:h="15840" w:orient="portrait"/>
       <w:pgMar w:top="1440" w:right="1440" w:bottom="1440" w:left="1440" w:header="708" w:footer="708" w:gutter="0"/>
       <w:cols w:space="708"/>
       <w:docGrid w:linePitch="360"/>
@@ -5287,7 +5098,7 @@
         <w:ind w:left="1440" w:hanging="360"/>
       </w:pPr>
       <w:rPr>
-        <w:rFonts w:ascii="Symbol" w:hAnsi="Symbol" w:hint="default"/>
+        <w:rFonts w:hint="default" w:ascii="Symbol" w:hAnsi="Symbol"/>
       </w:rPr>
     </w:lvl>
     <w:lvl w:ilvl="1" w:tplc="240A0003" w:tentative="1">
@@ -5299,7 +5110,7 @@
         <w:ind w:left="2160" w:hanging="360"/>
       </w:pPr>
       <w:rPr>
-        <w:rFonts w:ascii="Courier New" w:hAnsi="Courier New" w:cs="Courier New" w:hint="default"/>
+        <w:rFonts w:hint="default" w:ascii="Courier New" w:hAnsi="Courier New" w:cs="Courier New"/>
       </w:rPr>
     </w:lvl>
     <w:lvl w:ilvl="2" w:tplc="240A0005" w:tentative="1">
@@ -5311,7 +5122,7 @@
         <w:ind w:left="2880" w:hanging="360"/>
       </w:pPr>
       <w:rPr>
-        <w:rFonts w:ascii="Wingdings" w:hAnsi="Wingdings" w:hint="default"/>
+        <w:rFonts w:hint="default" w:ascii="Wingdings" w:hAnsi="Wingdings"/>
       </w:rPr>
     </w:lvl>
     <w:lvl w:ilvl="3" w:tplc="240A0001" w:tentative="1">
@@ -5323,7 +5134,7 @@
         <w:ind w:left="3600" w:hanging="360"/>
       </w:pPr>
       <w:rPr>
-        <w:rFonts w:ascii="Symbol" w:hAnsi="Symbol" w:hint="default"/>
+        <w:rFonts w:hint="default" w:ascii="Symbol" w:hAnsi="Symbol"/>
       </w:rPr>
     </w:lvl>
     <w:lvl w:ilvl="4" w:tplc="240A0003" w:tentative="1">
@@ -5335,7 +5146,7 @@
         <w:ind w:left="4320" w:hanging="360"/>
       </w:pPr>
       <w:rPr>
-        <w:rFonts w:ascii="Courier New" w:hAnsi="Courier New" w:cs="Courier New" w:hint="default"/>
+        <w:rFonts w:hint="default" w:ascii="Courier New" w:hAnsi="Courier New" w:cs="Courier New"/>
       </w:rPr>
     </w:lvl>
     <w:lvl w:ilvl="5" w:tplc="240A0005" w:tentative="1">
@@ -5347,7 +5158,7 @@
         <w:ind w:left="5040" w:hanging="360"/>
       </w:pPr>
       <w:rPr>
-        <w:rFonts w:ascii="Wingdings" w:hAnsi="Wingdings" w:hint="default"/>
+        <w:rFonts w:hint="default" w:ascii="Wingdings" w:hAnsi="Wingdings"/>
       </w:rPr>
     </w:lvl>
     <w:lvl w:ilvl="6" w:tplc="240A0001" w:tentative="1">
@@ -5359,7 +5170,7 @@
         <w:ind w:left="5760" w:hanging="360"/>
       </w:pPr>
       <w:rPr>
-        <w:rFonts w:ascii="Symbol" w:hAnsi="Symbol" w:hint="default"/>
+        <w:rFonts w:hint="default" w:ascii="Symbol" w:hAnsi="Symbol"/>
       </w:rPr>
     </w:lvl>
     <w:lvl w:ilvl="7" w:tplc="240A0003" w:tentative="1">
@@ -5371,7 +5182,7 @@
         <w:ind w:left="6480" w:hanging="360"/>
       </w:pPr>
       <w:rPr>
-        <w:rFonts w:ascii="Courier New" w:hAnsi="Courier New" w:cs="Courier New" w:hint="default"/>
+        <w:rFonts w:hint="default" w:ascii="Courier New" w:hAnsi="Courier New" w:cs="Courier New"/>
       </w:rPr>
     </w:lvl>
     <w:lvl w:ilvl="8" w:tplc="240A0005" w:tentative="1">
@@ -5383,7 +5194,7 @@
         <w:ind w:left="7200" w:hanging="360"/>
       </w:pPr>
       <w:rPr>
-        <w:rFonts w:ascii="Wingdings" w:hAnsi="Wingdings" w:hint="default"/>
+        <w:rFonts w:hint="default" w:ascii="Wingdings" w:hAnsi="Wingdings"/>
       </w:rPr>
     </w:lvl>
   </w:abstractNum>
@@ -5400,7 +5211,7 @@
         <w:ind w:left="1440" w:hanging="360"/>
       </w:pPr>
       <w:rPr>
-        <w:rFonts w:ascii="Symbol" w:hAnsi="Symbol" w:hint="default"/>
+        <w:rFonts w:hint="default" w:ascii="Symbol" w:hAnsi="Symbol"/>
       </w:rPr>
     </w:lvl>
     <w:lvl w:ilvl="1" w:tplc="240A0003" w:tentative="1">
@@ -5412,7 +5223,7 @@
         <w:ind w:left="2160" w:hanging="360"/>
       </w:pPr>
       <w:rPr>
-        <w:rFonts w:ascii="Courier New" w:hAnsi="Courier New" w:cs="Courier New" w:hint="default"/>
+        <w:rFonts w:hint="default" w:ascii="Courier New" w:hAnsi="Courier New" w:cs="Courier New"/>
       </w:rPr>
     </w:lvl>
     <w:lvl w:ilvl="2" w:tplc="240A0005" w:tentative="1">
@@ -5424,7 +5235,7 @@
         <w:ind w:left="2880" w:hanging="360"/>
       </w:pPr>
       <w:rPr>
-        <w:rFonts w:ascii="Wingdings" w:hAnsi="Wingdings" w:hint="default"/>
+        <w:rFonts w:hint="default" w:ascii="Wingdings" w:hAnsi="Wingdings"/>
       </w:rPr>
     </w:lvl>
     <w:lvl w:ilvl="3" w:tplc="240A0001" w:tentative="1">
@@ -5436,7 +5247,7 @@
         <w:ind w:left="3600" w:hanging="360"/>
       </w:pPr>
       <w:rPr>
-        <w:rFonts w:ascii="Symbol" w:hAnsi="Symbol" w:hint="default"/>
+        <w:rFonts w:hint="default" w:ascii="Symbol" w:hAnsi="Symbol"/>
       </w:rPr>
     </w:lvl>
     <w:lvl w:ilvl="4" w:tplc="240A0003" w:tentative="1">
@@ -5448,7 +5259,7 @@
         <w:ind w:left="4320" w:hanging="360"/>
       </w:pPr>
       <w:rPr>
-        <w:rFonts w:ascii="Courier New" w:hAnsi="Courier New" w:cs="Courier New" w:hint="default"/>
+        <w:rFonts w:hint="default" w:ascii="Courier New" w:hAnsi="Courier New" w:cs="Courier New"/>
       </w:rPr>
     </w:lvl>
     <w:lvl w:ilvl="5" w:tplc="240A0005" w:tentative="1">
@@ -5460,7 +5271,7 @@
         <w:ind w:left="5040" w:hanging="360"/>
       </w:pPr>
       <w:rPr>
-        <w:rFonts w:ascii="Wingdings" w:hAnsi="Wingdings" w:hint="default"/>
+        <w:rFonts w:hint="default" w:ascii="Wingdings" w:hAnsi="Wingdings"/>
       </w:rPr>
     </w:lvl>
     <w:lvl w:ilvl="6" w:tplc="240A0001" w:tentative="1">
@@ -5472,7 +5283,7 @@
         <w:ind w:left="5760" w:hanging="360"/>
       </w:pPr>
       <w:rPr>
-        <w:rFonts w:ascii="Symbol" w:hAnsi="Symbol" w:hint="default"/>
+        <w:rFonts w:hint="default" w:ascii="Symbol" w:hAnsi="Symbol"/>
       </w:rPr>
     </w:lvl>
     <w:lvl w:ilvl="7" w:tplc="240A0003" w:tentative="1">
@@ -5484,7 +5295,7 @@
         <w:ind w:left="6480" w:hanging="360"/>
       </w:pPr>
       <w:rPr>
-        <w:rFonts w:ascii="Courier New" w:hAnsi="Courier New" w:cs="Courier New" w:hint="default"/>
+        <w:rFonts w:hint="default" w:ascii="Courier New" w:hAnsi="Courier New" w:cs="Courier New"/>
       </w:rPr>
     </w:lvl>
     <w:lvl w:ilvl="8" w:tplc="240A0005" w:tentative="1">
@@ -5496,7 +5307,7 @@
         <w:ind w:left="7200" w:hanging="360"/>
       </w:pPr>
       <w:rPr>
-        <w:rFonts w:ascii="Wingdings" w:hAnsi="Wingdings" w:hint="default"/>
+        <w:rFonts w:hint="default" w:ascii="Wingdings" w:hAnsi="Wingdings"/>
       </w:rPr>
     </w:lvl>
   </w:abstractNum>
@@ -5599,7 +5410,7 @@
         <w:ind w:left="1440" w:hanging="360"/>
       </w:pPr>
       <w:rPr>
-        <w:rFonts w:ascii="Wingdings" w:hAnsi="Wingdings" w:hint="default"/>
+        <w:rFonts w:hint="default" w:ascii="Wingdings" w:hAnsi="Wingdings"/>
       </w:rPr>
     </w:lvl>
     <w:lvl w:ilvl="1" w:tplc="240A0003" w:tentative="1">
@@ -5611,7 +5422,7 @@
         <w:ind w:left="2160" w:hanging="360"/>
       </w:pPr>
       <w:rPr>
-        <w:rFonts w:ascii="Courier New" w:hAnsi="Courier New" w:cs="Courier New" w:hint="default"/>
+        <w:rFonts w:hint="default" w:ascii="Courier New" w:hAnsi="Courier New" w:cs="Courier New"/>
       </w:rPr>
     </w:lvl>
     <w:lvl w:ilvl="2" w:tplc="240A0005" w:tentative="1">
@@ -5623,7 +5434,7 @@
         <w:ind w:left="2880" w:hanging="360"/>
       </w:pPr>
       <w:rPr>
-        <w:rFonts w:ascii="Wingdings" w:hAnsi="Wingdings" w:hint="default"/>
+        <w:rFonts w:hint="default" w:ascii="Wingdings" w:hAnsi="Wingdings"/>
       </w:rPr>
     </w:lvl>
     <w:lvl w:ilvl="3" w:tplc="240A0001" w:tentative="1">
@@ -5635,7 +5446,7 @@
         <w:ind w:left="3600" w:hanging="360"/>
       </w:pPr>
       <w:rPr>
-        <w:rFonts w:ascii="Symbol" w:hAnsi="Symbol" w:hint="default"/>
+        <w:rFonts w:hint="default" w:ascii="Symbol" w:hAnsi="Symbol"/>
       </w:rPr>
     </w:lvl>
     <w:lvl w:ilvl="4" w:tplc="240A0003" w:tentative="1">
@@ -5647,7 +5458,7 @@
         <w:ind w:left="4320" w:hanging="360"/>
       </w:pPr>
       <w:rPr>
-        <w:rFonts w:ascii="Courier New" w:hAnsi="Courier New" w:cs="Courier New" w:hint="default"/>
+        <w:rFonts w:hint="default" w:ascii="Courier New" w:hAnsi="Courier New" w:cs="Courier New"/>
       </w:rPr>
     </w:lvl>
     <w:lvl w:ilvl="5" w:tplc="240A0005" w:tentative="1">
@@ -5659,7 +5470,7 @@
         <w:ind w:left="5040" w:hanging="360"/>
       </w:pPr>
       <w:rPr>
-        <w:rFonts w:ascii="Wingdings" w:hAnsi="Wingdings" w:hint="default"/>
+        <w:rFonts w:hint="default" w:ascii="Wingdings" w:hAnsi="Wingdings"/>
       </w:rPr>
     </w:lvl>
     <w:lvl w:ilvl="6" w:tplc="240A0001" w:tentative="1">
@@ -5671,7 +5482,7 @@
         <w:ind w:left="5760" w:hanging="360"/>
       </w:pPr>
       <w:rPr>
-        <w:rFonts w:ascii="Symbol" w:hAnsi="Symbol" w:hint="default"/>
+        <w:rFonts w:hint="default" w:ascii="Symbol" w:hAnsi="Symbol"/>
       </w:rPr>
     </w:lvl>
     <w:lvl w:ilvl="7" w:tplc="240A0003" w:tentative="1">
@@ -5683,7 +5494,7 @@
         <w:ind w:left="6480" w:hanging="360"/>
       </w:pPr>
       <w:rPr>
-        <w:rFonts w:ascii="Courier New" w:hAnsi="Courier New" w:cs="Courier New" w:hint="default"/>
+        <w:rFonts w:hint="default" w:ascii="Courier New" w:hAnsi="Courier New" w:cs="Courier New"/>
       </w:rPr>
     </w:lvl>
     <w:lvl w:ilvl="8" w:tplc="240A0005" w:tentative="1">
@@ -5695,7 +5506,7 @@
         <w:ind w:left="7200" w:hanging="360"/>
       </w:pPr>
       <w:rPr>
-        <w:rFonts w:ascii="Wingdings" w:hAnsi="Wingdings" w:hint="default"/>
+        <w:rFonts w:hint="default" w:ascii="Wingdings" w:hAnsi="Wingdings"/>
       </w:rPr>
     </w:lvl>
   </w:abstractNum>
@@ -5798,7 +5609,7 @@
         <w:ind w:left="720" w:hanging="360"/>
       </w:pPr>
       <w:rPr>
-        <w:rFonts w:ascii="Wingdings" w:hAnsi="Wingdings" w:hint="default"/>
+        <w:rFonts w:hint="default" w:ascii="Wingdings" w:hAnsi="Wingdings"/>
       </w:rPr>
     </w:lvl>
     <w:lvl w:ilvl="1" w:tplc="240A0003" w:tentative="1">
@@ -5810,7 +5621,7 @@
         <w:ind w:left="1440" w:hanging="360"/>
       </w:pPr>
       <w:rPr>
-        <w:rFonts w:ascii="Courier New" w:hAnsi="Courier New" w:cs="Courier New" w:hint="default"/>
+        <w:rFonts w:hint="default" w:ascii="Courier New" w:hAnsi="Courier New" w:cs="Courier New"/>
       </w:rPr>
     </w:lvl>
     <w:lvl w:ilvl="2" w:tplc="240A0005" w:tentative="1">
@@ -5822,7 +5633,7 @@
         <w:ind w:left="2160" w:hanging="360"/>
       </w:pPr>
       <w:rPr>
-        <w:rFonts w:ascii="Wingdings" w:hAnsi="Wingdings" w:hint="default"/>
+        <w:rFonts w:hint="default" w:ascii="Wingdings" w:hAnsi="Wingdings"/>
       </w:rPr>
     </w:lvl>
     <w:lvl w:ilvl="3" w:tplc="240A0001" w:tentative="1">
@@ -5834,7 +5645,7 @@
         <w:ind w:left="2880" w:hanging="360"/>
       </w:pPr>
       <w:rPr>
-        <w:rFonts w:ascii="Symbol" w:hAnsi="Symbol" w:hint="default"/>
+        <w:rFonts w:hint="default" w:ascii="Symbol" w:hAnsi="Symbol"/>
       </w:rPr>
     </w:lvl>
     <w:lvl w:ilvl="4" w:tplc="240A0003" w:tentative="1">
@@ -5846,7 +5657,7 @@
         <w:ind w:left="3600" w:hanging="360"/>
       </w:pPr>
       <w:rPr>
-        <w:rFonts w:ascii="Courier New" w:hAnsi="Courier New" w:cs="Courier New" w:hint="default"/>
+        <w:rFonts w:hint="default" w:ascii="Courier New" w:hAnsi="Courier New" w:cs="Courier New"/>
       </w:rPr>
     </w:lvl>
     <w:lvl w:ilvl="5" w:tplc="240A0005" w:tentative="1">
@@ -5858,7 +5669,7 @@
         <w:ind w:left="4320" w:hanging="360"/>
       </w:pPr>
       <w:rPr>
-        <w:rFonts w:ascii="Wingdings" w:hAnsi="Wingdings" w:hint="default"/>
+        <w:rFonts w:hint="default" w:ascii="Wingdings" w:hAnsi="Wingdings"/>
       </w:rPr>
     </w:lvl>
     <w:lvl w:ilvl="6" w:tplc="240A0001" w:tentative="1">
@@ -5870,7 +5681,7 @@
         <w:ind w:left="5040" w:hanging="360"/>
       </w:pPr>
       <w:rPr>
-        <w:rFonts w:ascii="Symbol" w:hAnsi="Symbol" w:hint="default"/>
+        <w:rFonts w:hint="default" w:ascii="Symbol" w:hAnsi="Symbol"/>
       </w:rPr>
     </w:lvl>
     <w:lvl w:ilvl="7" w:tplc="240A0003" w:tentative="1">
@@ -5882,7 +5693,7 @@
         <w:ind w:left="5760" w:hanging="360"/>
       </w:pPr>
       <w:rPr>
-        <w:rFonts w:ascii="Courier New" w:hAnsi="Courier New" w:cs="Courier New" w:hint="default"/>
+        <w:rFonts w:hint="default" w:ascii="Courier New" w:hAnsi="Courier New" w:cs="Courier New"/>
       </w:rPr>
     </w:lvl>
     <w:lvl w:ilvl="8" w:tplc="240A0005" w:tentative="1">
@@ -5894,7 +5705,7 @@
         <w:ind w:left="6480" w:hanging="360"/>
       </w:pPr>
       <w:rPr>
-        <w:rFonts w:ascii="Wingdings" w:hAnsi="Wingdings" w:hint="default"/>
+        <w:rFonts w:hint="default" w:ascii="Wingdings" w:hAnsi="Wingdings"/>
       </w:rPr>
     </w:lvl>
   </w:abstractNum>
@@ -6119,7 +5930,7 @@
         <w:ind w:left="1080" w:hanging="360"/>
       </w:pPr>
       <w:rPr>
-        <w:rFonts w:ascii="Symbol" w:hAnsi="Symbol" w:hint="default"/>
+        <w:rFonts w:hint="default" w:ascii="Symbol" w:hAnsi="Symbol"/>
       </w:rPr>
     </w:lvl>
     <w:lvl w:ilvl="1" w:tplc="240A0003" w:tentative="1">
@@ -6131,7 +5942,7 @@
         <w:ind w:left="1800" w:hanging="360"/>
       </w:pPr>
       <w:rPr>
-        <w:rFonts w:ascii="Courier New" w:hAnsi="Courier New" w:cs="Courier New" w:hint="default"/>
+        <w:rFonts w:hint="default" w:ascii="Courier New" w:hAnsi="Courier New" w:cs="Courier New"/>
       </w:rPr>
     </w:lvl>
     <w:lvl w:ilvl="2" w:tplc="240A0005" w:tentative="1">
@@ -6143,7 +5954,7 @@
         <w:ind w:left="2520" w:hanging="360"/>
       </w:pPr>
       <w:rPr>
-        <w:rFonts w:ascii="Wingdings" w:hAnsi="Wingdings" w:hint="default"/>
+        <w:rFonts w:hint="default" w:ascii="Wingdings" w:hAnsi="Wingdings"/>
       </w:rPr>
     </w:lvl>
     <w:lvl w:ilvl="3" w:tplc="240A0001" w:tentative="1">
@@ -6155,7 +5966,7 @@
         <w:ind w:left="3240" w:hanging="360"/>
       </w:pPr>
       <w:rPr>
-        <w:rFonts w:ascii="Symbol" w:hAnsi="Symbol" w:hint="default"/>
+        <w:rFonts w:hint="default" w:ascii="Symbol" w:hAnsi="Symbol"/>
       </w:rPr>
     </w:lvl>
     <w:lvl w:ilvl="4" w:tplc="240A0003" w:tentative="1">
@@ -6167,7 +5978,7 @@
         <w:ind w:left="3960" w:hanging="360"/>
       </w:pPr>
       <w:rPr>
-        <w:rFonts w:ascii="Courier New" w:hAnsi="Courier New" w:cs="Courier New" w:hint="default"/>
+        <w:rFonts w:hint="default" w:ascii="Courier New" w:hAnsi="Courier New" w:cs="Courier New"/>
       </w:rPr>
     </w:lvl>
     <w:lvl w:ilvl="5" w:tplc="240A0005" w:tentative="1">
@@ -6179,7 +5990,7 @@
         <w:ind w:left="4680" w:hanging="360"/>
       </w:pPr>
       <w:rPr>
-        <w:rFonts w:ascii="Wingdings" w:hAnsi="Wingdings" w:hint="default"/>
+        <w:rFonts w:hint="default" w:ascii="Wingdings" w:hAnsi="Wingdings"/>
       </w:rPr>
     </w:lvl>
     <w:lvl w:ilvl="6" w:tplc="240A0001" w:tentative="1">
@@ -6191,7 +6002,7 @@
         <w:ind w:left="5400" w:hanging="360"/>
       </w:pPr>
       <w:rPr>
-        <w:rFonts w:ascii="Symbol" w:hAnsi="Symbol" w:hint="default"/>
+        <w:rFonts w:hint="default" w:ascii="Symbol" w:hAnsi="Symbol"/>
       </w:rPr>
     </w:lvl>
     <w:lvl w:ilvl="7" w:tplc="240A0003" w:tentative="1">
@@ -6203,7 +6014,7 @@
         <w:ind w:left="6120" w:hanging="360"/>
       </w:pPr>
       <w:rPr>
-        <w:rFonts w:ascii="Courier New" w:hAnsi="Courier New" w:cs="Courier New" w:hint="default"/>
+        <w:rFonts w:hint="default" w:ascii="Courier New" w:hAnsi="Courier New" w:cs="Courier New"/>
       </w:rPr>
     </w:lvl>
     <w:lvl w:ilvl="8" w:tplc="240A0005" w:tentative="1">
@@ -6215,7 +6026,7 @@
         <w:ind w:left="6840" w:hanging="360"/>
       </w:pPr>
       <w:rPr>
-        <w:rFonts w:ascii="Wingdings" w:hAnsi="Wingdings" w:hint="default"/>
+        <w:rFonts w:hint="default" w:ascii="Wingdings" w:hAnsi="Wingdings"/>
       </w:rPr>
     </w:lvl>
   </w:abstractNum>
@@ -6318,7 +6129,7 @@
         <w:ind w:left="1440" w:hanging="360"/>
       </w:pPr>
       <w:rPr>
-        <w:rFonts w:ascii="Symbol" w:hAnsi="Symbol" w:hint="default"/>
+        <w:rFonts w:hint="default" w:ascii="Symbol" w:hAnsi="Symbol"/>
       </w:rPr>
     </w:lvl>
     <w:lvl w:ilvl="1" w:tplc="240A0003" w:tentative="1">
@@ -6330,7 +6141,7 @@
         <w:ind w:left="2160" w:hanging="360"/>
       </w:pPr>
       <w:rPr>
-        <w:rFonts w:ascii="Courier New" w:hAnsi="Courier New" w:cs="Courier New" w:hint="default"/>
+        <w:rFonts w:hint="default" w:ascii="Courier New" w:hAnsi="Courier New" w:cs="Courier New"/>
       </w:rPr>
     </w:lvl>
     <w:lvl w:ilvl="2" w:tplc="240A0005" w:tentative="1">
@@ -6342,7 +6153,7 @@
         <w:ind w:left="2880" w:hanging="360"/>
       </w:pPr>
       <w:rPr>
-        <w:rFonts w:ascii="Wingdings" w:hAnsi="Wingdings" w:hint="default"/>
+        <w:rFonts w:hint="default" w:ascii="Wingdings" w:hAnsi="Wingdings"/>
       </w:rPr>
     </w:lvl>
     <w:lvl w:ilvl="3" w:tplc="240A0001" w:tentative="1">
@@ -6354,7 +6165,7 @@
         <w:ind w:left="3600" w:hanging="360"/>
       </w:pPr>
       <w:rPr>
-        <w:rFonts w:ascii="Symbol" w:hAnsi="Symbol" w:hint="default"/>
+        <w:rFonts w:hint="default" w:ascii="Symbol" w:hAnsi="Symbol"/>
       </w:rPr>
     </w:lvl>
     <w:lvl w:ilvl="4" w:tplc="240A0003" w:tentative="1">
@@ -6366,7 +6177,7 @@
         <w:ind w:left="4320" w:hanging="360"/>
       </w:pPr>
       <w:rPr>
-        <w:rFonts w:ascii="Courier New" w:hAnsi="Courier New" w:cs="Courier New" w:hint="default"/>
+        <w:rFonts w:hint="default" w:ascii="Courier New" w:hAnsi="Courier New" w:cs="Courier New"/>
       </w:rPr>
     </w:lvl>
     <w:lvl w:ilvl="5" w:tplc="240A0005" w:tentative="1">
@@ -6378,7 +6189,7 @@
         <w:ind w:left="5040" w:hanging="360"/>
       </w:pPr>
       <w:rPr>
-        <w:rFonts w:ascii="Wingdings" w:hAnsi="Wingdings" w:hint="default"/>
+        <w:rFonts w:hint="default" w:ascii="Wingdings" w:hAnsi="Wingdings"/>
       </w:rPr>
     </w:lvl>
     <w:lvl w:ilvl="6" w:tplc="240A0001" w:tentative="1">
@@ -6390,7 +6201,7 @@
         <w:ind w:left="5760" w:hanging="360"/>
       </w:pPr>
       <w:rPr>
-        <w:rFonts w:ascii="Symbol" w:hAnsi="Symbol" w:hint="default"/>
+        <w:rFonts w:hint="default" w:ascii="Symbol" w:hAnsi="Symbol"/>
       </w:rPr>
     </w:lvl>
     <w:lvl w:ilvl="7" w:tplc="240A0003" w:tentative="1">
@@ -6402,7 +6213,7 @@
         <w:ind w:left="6480" w:hanging="360"/>
       </w:pPr>
       <w:rPr>
-        <w:rFonts w:ascii="Courier New" w:hAnsi="Courier New" w:cs="Courier New" w:hint="default"/>
+        <w:rFonts w:hint="default" w:ascii="Courier New" w:hAnsi="Courier New" w:cs="Courier New"/>
       </w:rPr>
     </w:lvl>
     <w:lvl w:ilvl="8" w:tplc="240A0005" w:tentative="1">
@@ -6414,7 +6225,7 @@
         <w:ind w:left="7200" w:hanging="360"/>
       </w:pPr>
       <w:rPr>
-        <w:rFonts w:ascii="Wingdings" w:hAnsi="Wingdings" w:hint="default"/>
+        <w:rFonts w:hint="default" w:ascii="Wingdings" w:hAnsi="Wingdings"/>
       </w:rPr>
     </w:lvl>
   </w:abstractNum>
@@ -6521,7 +6332,7 @@
         <w:ind w:left="360" w:hanging="360"/>
       </w:pPr>
       <w:rPr>
-        <w:rFonts w:ascii="Wingdings" w:hAnsi="Wingdings" w:hint="default"/>
+        <w:rFonts w:hint="default" w:ascii="Wingdings" w:hAnsi="Wingdings"/>
       </w:rPr>
     </w:lvl>
     <w:lvl w:ilvl="1">
@@ -6533,7 +6344,7 @@
         <w:ind w:left="720" w:hanging="360"/>
       </w:pPr>
       <w:rPr>
-        <w:rFonts w:ascii="Wingdings" w:hAnsi="Wingdings" w:hint="default"/>
+        <w:rFonts w:hint="default" w:ascii="Wingdings" w:hAnsi="Wingdings"/>
       </w:rPr>
     </w:lvl>
     <w:lvl w:ilvl="2">
@@ -6545,7 +6356,7 @@
         <w:ind w:left="1080" w:hanging="360"/>
       </w:pPr>
       <w:rPr>
-        <w:rFonts w:ascii="Wingdings" w:hAnsi="Wingdings" w:hint="default"/>
+        <w:rFonts w:hint="default" w:ascii="Wingdings" w:hAnsi="Wingdings"/>
       </w:rPr>
     </w:lvl>
     <w:lvl w:ilvl="3">
@@ -6557,7 +6368,7 @@
         <w:ind w:left="1440" w:hanging="360"/>
       </w:pPr>
       <w:rPr>
-        <w:rFonts w:ascii="Wingdings" w:hAnsi="Wingdings" w:hint="default"/>
+        <w:rFonts w:hint="default" w:ascii="Wingdings" w:hAnsi="Wingdings"/>
       </w:rPr>
     </w:lvl>
     <w:lvl w:ilvl="4">
@@ -6569,7 +6380,7 @@
         <w:ind w:left="1800" w:hanging="360"/>
       </w:pPr>
       <w:rPr>
-        <w:rFonts w:ascii="Symbol" w:hAnsi="Symbol" w:hint="default"/>
+        <w:rFonts w:hint="default" w:ascii="Symbol" w:hAnsi="Symbol"/>
       </w:rPr>
     </w:lvl>
     <w:lvl w:ilvl="5">
@@ -6581,7 +6392,7 @@
         <w:ind w:left="2160" w:hanging="360"/>
       </w:pPr>
       <w:rPr>
-        <w:rFonts w:ascii="Wingdings" w:hAnsi="Wingdings" w:hint="default"/>
+        <w:rFonts w:hint="default" w:ascii="Wingdings" w:hAnsi="Wingdings"/>
       </w:rPr>
     </w:lvl>
     <w:lvl w:ilvl="6">
@@ -6593,7 +6404,7 @@
         <w:ind w:left="2520" w:hanging="360"/>
       </w:pPr>
       <w:rPr>
-        <w:rFonts w:ascii="Wingdings" w:hAnsi="Wingdings" w:hint="default"/>
+        <w:rFonts w:hint="default" w:ascii="Wingdings" w:hAnsi="Wingdings"/>
       </w:rPr>
     </w:lvl>
     <w:lvl w:ilvl="7">
@@ -6605,7 +6416,7 @@
         <w:ind w:left="2880" w:hanging="360"/>
       </w:pPr>
       <w:rPr>
-        <w:rFonts w:ascii="Symbol" w:hAnsi="Symbol" w:hint="default"/>
+        <w:rFonts w:hint="default" w:ascii="Symbol" w:hAnsi="Symbol"/>
       </w:rPr>
     </w:lvl>
     <w:lvl w:ilvl="8">
@@ -6617,7 +6428,7 @@
         <w:ind w:left="3240" w:hanging="360"/>
       </w:pPr>
       <w:rPr>
-        <w:rFonts w:ascii="Symbol" w:hAnsi="Symbol" w:hint="default"/>
+        <w:rFonts w:hint="default" w:ascii="Symbol" w:hAnsi="Symbol"/>
       </w:rPr>
     </w:lvl>
   </w:abstractNum>
@@ -6633,7 +6444,7 @@
         <w:ind w:left="1080" w:hanging="360"/>
       </w:pPr>
       <w:rPr>
-        <w:rFonts w:ascii="Times New Roman" w:eastAsiaTheme="minorHAnsi" w:hAnsi="Times New Roman" w:cs="Times New Roman" w:hint="default"/>
+        <w:rFonts w:hint="default" w:ascii="Times New Roman" w:hAnsi="Times New Roman" w:cs="Times New Roman" w:eastAsiaTheme="minorHAnsi"/>
       </w:rPr>
     </w:lvl>
     <w:lvl w:ilvl="1" w:tplc="240A0003" w:tentative="1">
@@ -6645,7 +6456,7 @@
         <w:ind w:left="1800" w:hanging="360"/>
       </w:pPr>
       <w:rPr>
-        <w:rFonts w:ascii="Courier New" w:hAnsi="Courier New" w:cs="Courier New" w:hint="default"/>
+        <w:rFonts w:hint="default" w:ascii="Courier New" w:hAnsi="Courier New" w:cs="Courier New"/>
       </w:rPr>
     </w:lvl>
     <w:lvl w:ilvl="2" w:tplc="240A0005" w:tentative="1">
@@ -6657,7 +6468,7 @@
         <w:ind w:left="2520" w:hanging="360"/>
       </w:pPr>
       <w:rPr>
-        <w:rFonts w:ascii="Wingdings" w:hAnsi="Wingdings" w:hint="default"/>
+        <w:rFonts w:hint="default" w:ascii="Wingdings" w:hAnsi="Wingdings"/>
       </w:rPr>
     </w:lvl>
     <w:lvl w:ilvl="3" w:tplc="240A0001" w:tentative="1">
@@ -6669,7 +6480,7 @@
         <w:ind w:left="3240" w:hanging="360"/>
       </w:pPr>
       <w:rPr>
-        <w:rFonts w:ascii="Symbol" w:hAnsi="Symbol" w:hint="default"/>
+        <w:rFonts w:hint="default" w:ascii="Symbol" w:hAnsi="Symbol"/>
       </w:rPr>
     </w:lvl>
     <w:lvl w:ilvl="4" w:tplc="240A0003" w:tentative="1">
@@ -6681,7 +6492,7 @@
         <w:ind w:left="3960" w:hanging="360"/>
       </w:pPr>
       <w:rPr>
-        <w:rFonts w:ascii="Courier New" w:hAnsi="Courier New" w:cs="Courier New" w:hint="default"/>
+        <w:rFonts w:hint="default" w:ascii="Courier New" w:hAnsi="Courier New" w:cs="Courier New"/>
       </w:rPr>
     </w:lvl>
     <w:lvl w:ilvl="5" w:tplc="240A0005" w:tentative="1">
@@ -6693,7 +6504,7 @@
         <w:ind w:left="4680" w:hanging="360"/>
       </w:pPr>
       <w:rPr>
-        <w:rFonts w:ascii="Wingdings" w:hAnsi="Wingdings" w:hint="default"/>
+        <w:rFonts w:hint="default" w:ascii="Wingdings" w:hAnsi="Wingdings"/>
       </w:rPr>
     </w:lvl>
     <w:lvl w:ilvl="6" w:tplc="240A0001" w:tentative="1">
@@ -6705,7 +6516,7 @@
         <w:ind w:left="5400" w:hanging="360"/>
       </w:pPr>
       <w:rPr>
-        <w:rFonts w:ascii="Symbol" w:hAnsi="Symbol" w:hint="default"/>
+        <w:rFonts w:hint="default" w:ascii="Symbol" w:hAnsi="Symbol"/>
       </w:rPr>
     </w:lvl>
     <w:lvl w:ilvl="7" w:tplc="240A0003" w:tentative="1">
@@ -6717,7 +6528,7 @@
         <w:ind w:left="6120" w:hanging="360"/>
       </w:pPr>
       <w:rPr>
-        <w:rFonts w:ascii="Courier New" w:hAnsi="Courier New" w:cs="Courier New" w:hint="default"/>
+        <w:rFonts w:hint="default" w:ascii="Courier New" w:hAnsi="Courier New" w:cs="Courier New"/>
       </w:rPr>
     </w:lvl>
     <w:lvl w:ilvl="8" w:tplc="240A0005" w:tentative="1">
@@ -6729,7 +6540,7 @@
         <w:ind w:left="6840" w:hanging="360"/>
       </w:pPr>
       <w:rPr>
-        <w:rFonts w:ascii="Wingdings" w:hAnsi="Wingdings" w:hint="default"/>
+        <w:rFonts w:hint="default" w:ascii="Wingdings" w:hAnsi="Wingdings"/>
       </w:rPr>
     </w:lvl>
   </w:abstractNum>
@@ -6746,7 +6557,7 @@
         <w:ind w:left="360" w:hanging="360"/>
       </w:pPr>
       <w:rPr>
-        <w:rFonts w:ascii="Wingdings" w:hAnsi="Wingdings" w:hint="default"/>
+        <w:rFonts w:hint="default" w:ascii="Wingdings" w:hAnsi="Wingdings"/>
       </w:rPr>
     </w:lvl>
     <w:lvl w:ilvl="1">
@@ -6758,7 +6569,7 @@
         <w:ind w:left="720" w:hanging="360"/>
       </w:pPr>
       <w:rPr>
-        <w:rFonts w:ascii="Wingdings" w:hAnsi="Wingdings" w:hint="default"/>
+        <w:rFonts w:hint="default" w:ascii="Wingdings" w:hAnsi="Wingdings"/>
       </w:rPr>
     </w:lvl>
     <w:lvl w:ilvl="2">
@@ -6770,7 +6581,7 @@
         <w:ind w:left="1080" w:hanging="360"/>
       </w:pPr>
       <w:rPr>
-        <w:rFonts w:ascii="Wingdings" w:hAnsi="Wingdings" w:hint="default"/>
+        <w:rFonts w:hint="default" w:ascii="Wingdings" w:hAnsi="Wingdings"/>
       </w:rPr>
     </w:lvl>
     <w:lvl w:ilvl="3">
@@ -6782,7 +6593,7 @@
         <w:ind w:left="1440" w:hanging="360"/>
       </w:pPr>
       <w:rPr>
-        <w:rFonts w:ascii="Wingdings" w:hAnsi="Wingdings" w:hint="default"/>
+        <w:rFonts w:hint="default" w:ascii="Wingdings" w:hAnsi="Wingdings"/>
       </w:rPr>
     </w:lvl>
     <w:lvl w:ilvl="4">
@@ -6794,7 +6605,7 @@
         <w:ind w:left="1800" w:hanging="360"/>
       </w:pPr>
       <w:rPr>
-        <w:rFonts w:ascii="Symbol" w:hAnsi="Symbol" w:hint="default"/>
+        <w:rFonts w:hint="default" w:ascii="Symbol" w:hAnsi="Symbol"/>
       </w:rPr>
     </w:lvl>
     <w:lvl w:ilvl="5">
@@ -6806,7 +6617,7 @@
         <w:ind w:left="2160" w:hanging="360"/>
       </w:pPr>
       <w:rPr>
-        <w:rFonts w:ascii="Wingdings" w:hAnsi="Wingdings" w:hint="default"/>
+        <w:rFonts w:hint="default" w:ascii="Wingdings" w:hAnsi="Wingdings"/>
       </w:rPr>
     </w:lvl>
     <w:lvl w:ilvl="6">
@@ -6818,7 +6629,7 @@
         <w:ind w:left="2520" w:hanging="360"/>
       </w:pPr>
       <w:rPr>
-        <w:rFonts w:ascii="Wingdings" w:hAnsi="Wingdings" w:hint="default"/>
+        <w:rFonts w:hint="default" w:ascii="Wingdings" w:hAnsi="Wingdings"/>
       </w:rPr>
     </w:lvl>
     <w:lvl w:ilvl="7">
@@ -6830,7 +6641,7 @@
         <w:ind w:left="2880" w:hanging="360"/>
       </w:pPr>
       <w:rPr>
-        <w:rFonts w:ascii="Symbol" w:hAnsi="Symbol" w:hint="default"/>
+        <w:rFonts w:hint="default" w:ascii="Symbol" w:hAnsi="Symbol"/>
       </w:rPr>
     </w:lvl>
     <w:lvl w:ilvl="8">
@@ -6842,7 +6653,7 @@
         <w:ind w:left="3240" w:hanging="360"/>
       </w:pPr>
       <w:rPr>
-        <w:rFonts w:ascii="Symbol" w:hAnsi="Symbol" w:hint="default"/>
+        <w:rFonts w:hint="default" w:ascii="Symbol" w:hAnsi="Symbol"/>
       </w:rPr>
     </w:lvl>
   </w:abstractNum>
@@ -7127,7 +6938,7 @@
         <w:ind w:left="2160" w:hanging="360"/>
       </w:pPr>
       <w:rPr>
-        <w:rFonts w:ascii="Symbol" w:hAnsi="Symbol" w:hint="default"/>
+        <w:rFonts w:hint="default" w:ascii="Symbol" w:hAnsi="Symbol"/>
       </w:rPr>
     </w:lvl>
     <w:lvl w:ilvl="1" w:tplc="240A0003" w:tentative="1">
@@ -7139,7 +6950,7 @@
         <w:ind w:left="2880" w:hanging="360"/>
       </w:pPr>
       <w:rPr>
-        <w:rFonts w:ascii="Courier New" w:hAnsi="Courier New" w:cs="Courier New" w:hint="default"/>
+        <w:rFonts w:hint="default" w:ascii="Courier New" w:hAnsi="Courier New" w:cs="Courier New"/>
       </w:rPr>
     </w:lvl>
     <w:lvl w:ilvl="2" w:tplc="240A0005" w:tentative="1">
@@ -7151,7 +6962,7 @@
         <w:ind w:left="3600" w:hanging="360"/>
       </w:pPr>
       <w:rPr>
-        <w:rFonts w:ascii="Wingdings" w:hAnsi="Wingdings" w:hint="default"/>
+        <w:rFonts w:hint="default" w:ascii="Wingdings" w:hAnsi="Wingdings"/>
       </w:rPr>
     </w:lvl>
     <w:lvl w:ilvl="3" w:tplc="240A0001" w:tentative="1">
@@ -7163,7 +6974,7 @@
         <w:ind w:left="4320" w:hanging="360"/>
       </w:pPr>
       <w:rPr>
-        <w:rFonts w:ascii="Symbol" w:hAnsi="Symbol" w:hint="default"/>
+        <w:rFonts w:hint="default" w:ascii="Symbol" w:hAnsi="Symbol"/>
       </w:rPr>
     </w:lvl>
     <w:lvl w:ilvl="4" w:tplc="240A0003" w:tentative="1">
@@ -7175,7 +6986,7 @@
         <w:ind w:left="5040" w:hanging="360"/>
       </w:pPr>
       <w:rPr>
-        <w:rFonts w:ascii="Courier New" w:hAnsi="Courier New" w:cs="Courier New" w:hint="default"/>
+        <w:rFonts w:hint="default" w:ascii="Courier New" w:hAnsi="Courier New" w:cs="Courier New"/>
       </w:rPr>
     </w:lvl>
     <w:lvl w:ilvl="5" w:tplc="240A0005" w:tentative="1">
@@ -7187,7 +6998,7 @@
         <w:ind w:left="5760" w:hanging="360"/>
       </w:pPr>
       <w:rPr>
-        <w:rFonts w:ascii="Wingdings" w:hAnsi="Wingdings" w:hint="default"/>
+        <w:rFonts w:hint="default" w:ascii="Wingdings" w:hAnsi="Wingdings"/>
       </w:rPr>
     </w:lvl>
     <w:lvl w:ilvl="6" w:tplc="240A0001" w:tentative="1">
@@ -7199,7 +7010,7 @@
         <w:ind w:left="6480" w:hanging="360"/>
       </w:pPr>
       <w:rPr>
-        <w:rFonts w:ascii="Symbol" w:hAnsi="Symbol" w:hint="default"/>
+        <w:rFonts w:hint="default" w:ascii="Symbol" w:hAnsi="Symbol"/>
       </w:rPr>
     </w:lvl>
     <w:lvl w:ilvl="7" w:tplc="240A0003" w:tentative="1">
@@ -7211,7 +7022,7 @@
         <w:ind w:left="7200" w:hanging="360"/>
       </w:pPr>
       <w:rPr>
-        <w:rFonts w:ascii="Courier New" w:hAnsi="Courier New" w:cs="Courier New" w:hint="default"/>
+        <w:rFonts w:hint="default" w:ascii="Courier New" w:hAnsi="Courier New" w:cs="Courier New"/>
       </w:rPr>
     </w:lvl>
     <w:lvl w:ilvl="8" w:tplc="240A0005" w:tentative="1">
@@ -7223,7 +7034,7 @@
         <w:ind w:left="7920" w:hanging="360"/>
       </w:pPr>
       <w:rPr>
-        <w:rFonts w:ascii="Wingdings" w:hAnsi="Wingdings" w:hint="default"/>
+        <w:rFonts w:hint="default" w:ascii="Wingdings" w:hAnsi="Wingdings"/>
       </w:rPr>
     </w:lvl>
   </w:abstractNum>
@@ -7240,7 +7051,7 @@
         <w:ind w:left="1440" w:hanging="360"/>
       </w:pPr>
       <w:rPr>
-        <w:rFonts w:ascii="Symbol" w:hAnsi="Symbol" w:hint="default"/>
+        <w:rFonts w:hint="default" w:ascii="Symbol" w:hAnsi="Symbol"/>
       </w:rPr>
     </w:lvl>
     <w:lvl w:ilvl="1" w:tplc="240A0003" w:tentative="1">
@@ -7252,7 +7063,7 @@
         <w:ind w:left="2160" w:hanging="360"/>
       </w:pPr>
       <w:rPr>
-        <w:rFonts w:ascii="Courier New" w:hAnsi="Courier New" w:cs="Courier New" w:hint="default"/>
+        <w:rFonts w:hint="default" w:ascii="Courier New" w:hAnsi="Courier New" w:cs="Courier New"/>
       </w:rPr>
     </w:lvl>
     <w:lvl w:ilvl="2" w:tplc="240A0005" w:tentative="1">
@@ -7264,7 +7075,7 @@
         <w:ind w:left="2880" w:hanging="360"/>
       </w:pPr>
       <w:rPr>
-        <w:rFonts w:ascii="Wingdings" w:hAnsi="Wingdings" w:hint="default"/>
+        <w:rFonts w:hint="default" w:ascii="Wingdings" w:hAnsi="Wingdings"/>
       </w:rPr>
     </w:lvl>
     <w:lvl w:ilvl="3" w:tplc="240A0001" w:tentative="1">
@@ -7276,7 +7087,7 @@
         <w:ind w:left="3600" w:hanging="360"/>
       </w:pPr>
       <w:rPr>
-        <w:rFonts w:ascii="Symbol" w:hAnsi="Symbol" w:hint="default"/>
+        <w:rFonts w:hint="default" w:ascii="Symbol" w:hAnsi="Symbol"/>
       </w:rPr>
     </w:lvl>
     <w:lvl w:ilvl="4" w:tplc="240A0003" w:tentative="1">
@@ -7288,7 +7099,7 @@
         <w:ind w:left="4320" w:hanging="360"/>
       </w:pPr>
       <w:rPr>
-        <w:rFonts w:ascii="Courier New" w:hAnsi="Courier New" w:cs="Courier New" w:hint="default"/>
+        <w:rFonts w:hint="default" w:ascii="Courier New" w:hAnsi="Courier New" w:cs="Courier New"/>
       </w:rPr>
     </w:lvl>
     <w:lvl w:ilvl="5" w:tplc="240A0005" w:tentative="1">
@@ -7300,7 +7111,7 @@
         <w:ind w:left="5040" w:hanging="360"/>
       </w:pPr>
       <w:rPr>
-        <w:rFonts w:ascii="Wingdings" w:hAnsi="Wingdings" w:hint="default"/>
+        <w:rFonts w:hint="default" w:ascii="Wingdings" w:hAnsi="Wingdings"/>
       </w:rPr>
     </w:lvl>
     <w:lvl w:ilvl="6" w:tplc="240A0001" w:tentative="1">
@@ -7312,7 +7123,7 @@
         <w:ind w:left="5760" w:hanging="360"/>
       </w:pPr>
       <w:rPr>
-        <w:rFonts w:ascii="Symbol" w:hAnsi="Symbol" w:hint="default"/>
+        <w:rFonts w:hint="default" w:ascii="Symbol" w:hAnsi="Symbol"/>
       </w:rPr>
     </w:lvl>
     <w:lvl w:ilvl="7" w:tplc="240A0003" w:tentative="1">
@@ -7324,7 +7135,7 @@
         <w:ind w:left="6480" w:hanging="360"/>
       </w:pPr>
       <w:rPr>
-        <w:rFonts w:ascii="Courier New" w:hAnsi="Courier New" w:cs="Courier New" w:hint="default"/>
+        <w:rFonts w:hint="default" w:ascii="Courier New" w:hAnsi="Courier New" w:cs="Courier New"/>
       </w:rPr>
     </w:lvl>
     <w:lvl w:ilvl="8" w:tplc="240A0005" w:tentative="1">
@@ -7336,7 +7147,7 @@
         <w:ind w:left="7200" w:hanging="360"/>
       </w:pPr>
       <w:rPr>
-        <w:rFonts w:ascii="Wingdings" w:hAnsi="Wingdings" w:hint="default"/>
+        <w:rFonts w:hint="default" w:ascii="Wingdings" w:hAnsi="Wingdings"/>
       </w:rPr>
     </w:lvl>
   </w:abstractNum>
@@ -7353,7 +7164,7 @@
         <w:ind w:left="720" w:hanging="360"/>
       </w:pPr>
       <w:rPr>
-        <w:rFonts w:ascii="Wingdings" w:hAnsi="Wingdings" w:hint="default"/>
+        <w:rFonts w:hint="default" w:ascii="Wingdings" w:hAnsi="Wingdings"/>
       </w:rPr>
     </w:lvl>
     <w:lvl w:ilvl="1" w:tplc="240A0003" w:tentative="1">
@@ -7365,7 +7176,7 @@
         <w:ind w:left="1440" w:hanging="360"/>
       </w:pPr>
       <w:rPr>
-        <w:rFonts w:ascii="Courier New" w:hAnsi="Courier New" w:cs="Courier New" w:hint="default"/>
+        <w:rFonts w:hint="default" w:ascii="Courier New" w:hAnsi="Courier New" w:cs="Courier New"/>
       </w:rPr>
     </w:lvl>
     <w:lvl w:ilvl="2" w:tplc="240A0005" w:tentative="1">
@@ -7377,7 +7188,7 @@
         <w:ind w:left="2160" w:hanging="360"/>
       </w:pPr>
       <w:rPr>
-        <w:rFonts w:ascii="Wingdings" w:hAnsi="Wingdings" w:hint="default"/>
+        <w:rFonts w:hint="default" w:ascii="Wingdings" w:hAnsi="Wingdings"/>
       </w:rPr>
     </w:lvl>
     <w:lvl w:ilvl="3" w:tplc="240A0001" w:tentative="1">
@@ -7389,7 +7200,7 @@
         <w:ind w:left="2880" w:hanging="360"/>
       </w:pPr>
       <w:rPr>
-        <w:rFonts w:ascii="Symbol" w:hAnsi="Symbol" w:hint="default"/>
+        <w:rFonts w:hint="default" w:ascii="Symbol" w:hAnsi="Symbol"/>
       </w:rPr>
     </w:lvl>
     <w:lvl w:ilvl="4" w:tplc="240A0003" w:tentative="1">
@@ -7401,7 +7212,7 @@
         <w:ind w:left="3600" w:hanging="360"/>
       </w:pPr>
       <w:rPr>
-        <w:rFonts w:ascii="Courier New" w:hAnsi="Courier New" w:cs="Courier New" w:hint="default"/>
+        <w:rFonts w:hint="default" w:ascii="Courier New" w:hAnsi="Courier New" w:cs="Courier New"/>
       </w:rPr>
     </w:lvl>
     <w:lvl w:ilvl="5" w:tplc="240A0005" w:tentative="1">
@@ -7413,7 +7224,7 @@
         <w:ind w:left="4320" w:hanging="360"/>
       </w:pPr>
       <w:rPr>
-        <w:rFonts w:ascii="Wingdings" w:hAnsi="Wingdings" w:hint="default"/>
+        <w:rFonts w:hint="default" w:ascii="Wingdings" w:hAnsi="Wingdings"/>
       </w:rPr>
     </w:lvl>
     <w:lvl w:ilvl="6" w:tplc="240A0001" w:tentative="1">
@@ -7425,7 +7236,7 @@
         <w:ind w:left="5040" w:hanging="360"/>
       </w:pPr>
       <w:rPr>
-        <w:rFonts w:ascii="Symbol" w:hAnsi="Symbol" w:hint="default"/>
+        <w:rFonts w:hint="default" w:ascii="Symbol" w:hAnsi="Symbol"/>
       </w:rPr>
     </w:lvl>
     <w:lvl w:ilvl="7" w:tplc="240A0003" w:tentative="1">
@@ -7437,7 +7248,7 @@
         <w:ind w:left="5760" w:hanging="360"/>
       </w:pPr>
       <w:rPr>
-        <w:rFonts w:ascii="Courier New" w:hAnsi="Courier New" w:cs="Courier New" w:hint="default"/>
+        <w:rFonts w:hint="default" w:ascii="Courier New" w:hAnsi="Courier New" w:cs="Courier New"/>
       </w:rPr>
     </w:lvl>
     <w:lvl w:ilvl="8" w:tplc="240A0005" w:tentative="1">
@@ -7449,7 +7260,7 @@
         <w:ind w:left="6480" w:hanging="360"/>
       </w:pPr>
       <w:rPr>
-        <w:rFonts w:ascii="Wingdings" w:hAnsi="Wingdings" w:hint="default"/>
+        <w:rFonts w:hint="default" w:ascii="Wingdings" w:hAnsi="Wingdings"/>
       </w:rPr>
     </w:lvl>
   </w:abstractNum>
@@ -7466,7 +7277,7 @@
         <w:ind w:left="1440" w:hanging="360"/>
       </w:pPr>
       <w:rPr>
-        <w:rFonts w:ascii="Symbol" w:hAnsi="Symbol" w:hint="default"/>
+        <w:rFonts w:hint="default" w:ascii="Symbol" w:hAnsi="Symbol"/>
         <w:sz w:val="24"/>
         <w:szCs w:val="24"/>
       </w:rPr>
@@ -7480,7 +7291,7 @@
         <w:ind w:left="2160" w:hanging="360"/>
       </w:pPr>
       <w:rPr>
-        <w:rFonts w:ascii="Courier New" w:hAnsi="Courier New" w:cs="Courier New" w:hint="default"/>
+        <w:rFonts w:hint="default" w:ascii="Courier New" w:hAnsi="Courier New" w:cs="Courier New"/>
       </w:rPr>
     </w:lvl>
     <w:lvl w:ilvl="2" w:tplc="240A0005" w:tentative="1">
@@ -7492,7 +7303,7 @@
         <w:ind w:left="2880" w:hanging="360"/>
       </w:pPr>
       <w:rPr>
-        <w:rFonts w:ascii="Wingdings" w:hAnsi="Wingdings" w:hint="default"/>
+        <w:rFonts w:hint="default" w:ascii="Wingdings" w:hAnsi="Wingdings"/>
       </w:rPr>
     </w:lvl>
     <w:lvl w:ilvl="3" w:tplc="240A0001" w:tentative="1">
@@ -7504,7 +7315,7 @@
         <w:ind w:left="3600" w:hanging="360"/>
       </w:pPr>
       <w:rPr>
-        <w:rFonts w:ascii="Symbol" w:hAnsi="Symbol" w:hint="default"/>
+        <w:rFonts w:hint="default" w:ascii="Symbol" w:hAnsi="Symbol"/>
       </w:rPr>
     </w:lvl>
     <w:lvl w:ilvl="4" w:tplc="240A0003" w:tentative="1">
@@ -7516,7 +7327,7 @@
         <w:ind w:left="4320" w:hanging="360"/>
       </w:pPr>
       <w:rPr>
-        <w:rFonts w:ascii="Courier New" w:hAnsi="Courier New" w:cs="Courier New" w:hint="default"/>
+        <w:rFonts w:hint="default" w:ascii="Courier New" w:hAnsi="Courier New" w:cs="Courier New"/>
       </w:rPr>
     </w:lvl>
     <w:lvl w:ilvl="5" w:tplc="240A0005" w:tentative="1">
@@ -7528,7 +7339,7 @@
         <w:ind w:left="5040" w:hanging="360"/>
       </w:pPr>
       <w:rPr>
-        <w:rFonts w:ascii="Wingdings" w:hAnsi="Wingdings" w:hint="default"/>
+        <w:rFonts w:hint="default" w:ascii="Wingdings" w:hAnsi="Wingdings"/>
       </w:rPr>
     </w:lvl>
     <w:lvl w:ilvl="6" w:tplc="240A0001" w:tentative="1">
@@ -7540,7 +7351,7 @@
         <w:ind w:left="5760" w:hanging="360"/>
       </w:pPr>
       <w:rPr>
-        <w:rFonts w:ascii="Symbol" w:hAnsi="Symbol" w:hint="default"/>
+        <w:rFonts w:hint="default" w:ascii="Symbol" w:hAnsi="Symbol"/>
       </w:rPr>
     </w:lvl>
     <w:lvl w:ilvl="7" w:tplc="240A0003" w:tentative="1">
@@ -7552,7 +7363,7 @@
         <w:ind w:left="6480" w:hanging="360"/>
       </w:pPr>
       <w:rPr>
-        <w:rFonts w:ascii="Courier New" w:hAnsi="Courier New" w:cs="Courier New" w:hint="default"/>
+        <w:rFonts w:hint="default" w:ascii="Courier New" w:hAnsi="Courier New" w:cs="Courier New"/>
       </w:rPr>
     </w:lvl>
     <w:lvl w:ilvl="8" w:tplc="240A0005" w:tentative="1">
@@ -7564,7 +7375,7 @@
         <w:ind w:left="7200" w:hanging="360"/>
       </w:pPr>
       <w:rPr>
-        <w:rFonts w:ascii="Wingdings" w:hAnsi="Wingdings" w:hint="default"/>
+        <w:rFonts w:hint="default" w:ascii="Wingdings" w:hAnsi="Wingdings"/>
       </w:rPr>
     </w:lvl>
   </w:abstractNum>
@@ -7581,7 +7392,7 @@
         <w:ind w:left="1440" w:hanging="360"/>
       </w:pPr>
       <w:rPr>
-        <w:rFonts w:ascii="Symbol" w:hAnsi="Symbol" w:hint="default"/>
+        <w:rFonts w:hint="default" w:ascii="Symbol" w:hAnsi="Symbol"/>
       </w:rPr>
     </w:lvl>
     <w:lvl w:ilvl="1" w:tplc="240A0003" w:tentative="1">
@@ -7593,7 +7404,7 @@
         <w:ind w:left="2160" w:hanging="360"/>
       </w:pPr>
       <w:rPr>
-        <w:rFonts w:ascii="Courier New" w:hAnsi="Courier New" w:cs="Courier New" w:hint="default"/>
+        <w:rFonts w:hint="default" w:ascii="Courier New" w:hAnsi="Courier New" w:cs="Courier New"/>
       </w:rPr>
     </w:lvl>
     <w:lvl w:ilvl="2" w:tplc="240A0005" w:tentative="1">
@@ -7605,7 +7416,7 @@
         <w:ind w:left="2880" w:hanging="360"/>
       </w:pPr>
       <w:rPr>
-        <w:rFonts w:ascii="Wingdings" w:hAnsi="Wingdings" w:hint="default"/>
+        <w:rFonts w:hint="default" w:ascii="Wingdings" w:hAnsi="Wingdings"/>
       </w:rPr>
     </w:lvl>
     <w:lvl w:ilvl="3" w:tplc="240A0001" w:tentative="1">
@@ -7617,7 +7428,7 @@
         <w:ind w:left="3600" w:hanging="360"/>
       </w:pPr>
       <w:rPr>
-        <w:rFonts w:ascii="Symbol" w:hAnsi="Symbol" w:hint="default"/>
+        <w:rFonts w:hint="default" w:ascii="Symbol" w:hAnsi="Symbol"/>
       </w:rPr>
     </w:lvl>
     <w:lvl w:ilvl="4" w:tplc="240A0003" w:tentative="1">
@@ -7629,7 +7440,7 @@
         <w:ind w:left="4320" w:hanging="360"/>
       </w:pPr>
       <w:rPr>
-        <w:rFonts w:ascii="Courier New" w:hAnsi="Courier New" w:cs="Courier New" w:hint="default"/>
+        <w:rFonts w:hint="default" w:ascii="Courier New" w:hAnsi="Courier New" w:cs="Courier New"/>
       </w:rPr>
     </w:lvl>
     <w:lvl w:ilvl="5" w:tplc="240A0005" w:tentative="1">
@@ -7641,7 +7452,7 @@
         <w:ind w:left="5040" w:hanging="360"/>
       </w:pPr>
       <w:rPr>
-        <w:rFonts w:ascii="Wingdings" w:hAnsi="Wingdings" w:hint="default"/>
+        <w:rFonts w:hint="default" w:ascii="Wingdings" w:hAnsi="Wingdings"/>
       </w:rPr>
     </w:lvl>
     <w:lvl w:ilvl="6" w:tplc="240A0001" w:tentative="1">
@@ -7653,7 +7464,7 @@
         <w:ind w:left="5760" w:hanging="360"/>
       </w:pPr>
       <w:rPr>
-        <w:rFonts w:ascii="Symbol" w:hAnsi="Symbol" w:hint="default"/>
+        <w:rFonts w:hint="default" w:ascii="Symbol" w:hAnsi="Symbol"/>
       </w:rPr>
     </w:lvl>
     <w:lvl w:ilvl="7" w:tplc="240A0003" w:tentative="1">
@@ -7665,7 +7476,7 @@
         <w:ind w:left="6480" w:hanging="360"/>
       </w:pPr>
       <w:rPr>
-        <w:rFonts w:ascii="Courier New" w:hAnsi="Courier New" w:cs="Courier New" w:hint="default"/>
+        <w:rFonts w:hint="default" w:ascii="Courier New" w:hAnsi="Courier New" w:cs="Courier New"/>
       </w:rPr>
     </w:lvl>
     <w:lvl w:ilvl="8" w:tplc="240A0005" w:tentative="1">
@@ -7677,7 +7488,7 @@
         <w:ind w:left="7200" w:hanging="360"/>
       </w:pPr>
       <w:rPr>
-        <w:rFonts w:ascii="Wingdings" w:hAnsi="Wingdings" w:hint="default"/>
+        <w:rFonts w:hint="default" w:ascii="Wingdings" w:hAnsi="Wingdings"/>
       </w:rPr>
     </w:lvl>
   </w:abstractNum>
@@ -7694,7 +7505,7 @@
         <w:ind w:left="720" w:hanging="360"/>
       </w:pPr>
       <w:rPr>
-        <w:rFonts w:ascii="Wingdings" w:hAnsi="Wingdings" w:hint="default"/>
+        <w:rFonts w:hint="default" w:ascii="Wingdings" w:hAnsi="Wingdings"/>
       </w:rPr>
     </w:lvl>
     <w:lvl w:ilvl="1" w:tplc="240A0003" w:tentative="1">
@@ -7706,7 +7517,7 @@
         <w:ind w:left="1440" w:hanging="360"/>
       </w:pPr>
       <w:rPr>
-        <w:rFonts w:ascii="Courier New" w:hAnsi="Courier New" w:cs="Courier New" w:hint="default"/>
+        <w:rFonts w:hint="default" w:ascii="Courier New" w:hAnsi="Courier New" w:cs="Courier New"/>
       </w:rPr>
     </w:lvl>
     <w:lvl w:ilvl="2" w:tplc="240A0005" w:tentative="1">
@@ -7718,7 +7529,7 @@
         <w:ind w:left="2160" w:hanging="360"/>
       </w:pPr>
       <w:rPr>
-        <w:rFonts w:ascii="Wingdings" w:hAnsi="Wingdings" w:hint="default"/>
+        <w:rFonts w:hint="default" w:ascii="Wingdings" w:hAnsi="Wingdings"/>
       </w:rPr>
     </w:lvl>
     <w:lvl w:ilvl="3" w:tplc="240A0001" w:tentative="1">
@@ -7730,7 +7541,7 @@
         <w:ind w:left="2880" w:hanging="360"/>
       </w:pPr>
       <w:rPr>
-        <w:rFonts w:ascii="Symbol" w:hAnsi="Symbol" w:hint="default"/>
+        <w:rFonts w:hint="default" w:ascii="Symbol" w:hAnsi="Symbol"/>
       </w:rPr>
     </w:lvl>
     <w:lvl w:ilvl="4" w:tplc="240A0003" w:tentative="1">
@@ -7742,7 +7553,7 @@
         <w:ind w:left="3600" w:hanging="360"/>
       </w:pPr>
       <w:rPr>
-        <w:rFonts w:ascii="Courier New" w:hAnsi="Courier New" w:cs="Courier New" w:hint="default"/>
+        <w:rFonts w:hint="default" w:ascii="Courier New" w:hAnsi="Courier New" w:cs="Courier New"/>
       </w:rPr>
     </w:lvl>
     <w:lvl w:ilvl="5" w:tplc="240A0005" w:tentative="1">
@@ -7754,7 +7565,7 @@
         <w:ind w:left="4320" w:hanging="360"/>
       </w:pPr>
       <w:rPr>
-        <w:rFonts w:ascii="Wingdings" w:hAnsi="Wingdings" w:hint="default"/>
+        <w:rFonts w:hint="default" w:ascii="Wingdings" w:hAnsi="Wingdings"/>
       </w:rPr>
     </w:lvl>
     <w:lvl w:ilvl="6" w:tplc="240A0001" w:tentative="1">
@@ -7766,7 +7577,7 @@
         <w:ind w:left="5040" w:hanging="360"/>
       </w:pPr>
       <w:rPr>
-        <w:rFonts w:ascii="Symbol" w:hAnsi="Symbol" w:hint="default"/>
+        <w:rFonts w:hint="default" w:ascii="Symbol" w:hAnsi="Symbol"/>
       </w:rPr>
     </w:lvl>
     <w:lvl w:ilvl="7" w:tplc="240A0003" w:tentative="1">
@@ -7778,7 +7589,7 @@
         <w:ind w:left="5760" w:hanging="360"/>
       </w:pPr>
       <w:rPr>
-        <w:rFonts w:ascii="Courier New" w:hAnsi="Courier New" w:cs="Courier New" w:hint="default"/>
+        <w:rFonts w:hint="default" w:ascii="Courier New" w:hAnsi="Courier New" w:cs="Courier New"/>
       </w:rPr>
     </w:lvl>
     <w:lvl w:ilvl="8" w:tplc="240A0005" w:tentative="1">
@@ -7790,7 +7601,7 @@
         <w:ind w:left="6480" w:hanging="360"/>
       </w:pPr>
       <w:rPr>
-        <w:rFonts w:ascii="Wingdings" w:hAnsi="Wingdings" w:hint="default"/>
+        <w:rFonts w:hint="default" w:ascii="Wingdings" w:hAnsi="Wingdings"/>
       </w:rPr>
     </w:lvl>
   </w:abstractNum>
@@ -7807,7 +7618,7 @@
         <w:ind w:left="1440" w:hanging="360"/>
       </w:pPr>
       <w:rPr>
-        <w:rFonts w:ascii="Symbol" w:hAnsi="Symbol" w:hint="default"/>
+        <w:rFonts w:hint="default" w:ascii="Symbol" w:hAnsi="Symbol"/>
       </w:rPr>
     </w:lvl>
     <w:lvl w:ilvl="1" w:tplc="240A0003" w:tentative="1">
@@ -7819,7 +7630,7 @@
         <w:ind w:left="2160" w:hanging="360"/>
       </w:pPr>
       <w:rPr>
-        <w:rFonts w:ascii="Courier New" w:hAnsi="Courier New" w:cs="Courier New" w:hint="default"/>
+        <w:rFonts w:hint="default" w:ascii="Courier New" w:hAnsi="Courier New" w:cs="Courier New"/>
       </w:rPr>
     </w:lvl>
     <w:lvl w:ilvl="2" w:tplc="240A0005" w:tentative="1">
@@ -7831,7 +7642,7 @@
         <w:ind w:left="2880" w:hanging="360"/>
       </w:pPr>
       <w:rPr>
-        <w:rFonts w:ascii="Wingdings" w:hAnsi="Wingdings" w:hint="default"/>
+        <w:rFonts w:hint="default" w:ascii="Wingdings" w:hAnsi="Wingdings"/>
       </w:rPr>
     </w:lvl>
     <w:lvl w:ilvl="3" w:tplc="240A0001" w:tentative="1">
@@ -7843,7 +7654,7 @@
         <w:ind w:left="3600" w:hanging="360"/>
       </w:pPr>
       <w:rPr>
-        <w:rFonts w:ascii="Symbol" w:hAnsi="Symbol" w:hint="default"/>
+        <w:rFonts w:hint="default" w:ascii="Symbol" w:hAnsi="Symbol"/>
       </w:rPr>
     </w:lvl>
     <w:lvl w:ilvl="4" w:tplc="240A0003" w:tentative="1">
@@ -7855,7 +7666,7 @@
         <w:ind w:left="4320" w:hanging="360"/>
       </w:pPr>
       <w:rPr>
-        <w:rFonts w:ascii="Courier New" w:hAnsi="Courier New" w:cs="Courier New" w:hint="default"/>
+        <w:rFonts w:hint="default" w:ascii="Courier New" w:hAnsi="Courier New" w:cs="Courier New"/>
       </w:rPr>
     </w:lvl>
     <w:lvl w:ilvl="5" w:tplc="240A0005" w:tentative="1">
@@ -7867,7 +7678,7 @@
         <w:ind w:left="5040" w:hanging="360"/>
       </w:pPr>
       <w:rPr>
-        <w:rFonts w:ascii="Wingdings" w:hAnsi="Wingdings" w:hint="default"/>
+        <w:rFonts w:hint="default" w:ascii="Wingdings" w:hAnsi="Wingdings"/>
       </w:rPr>
     </w:lvl>
     <w:lvl w:ilvl="6" w:tplc="240A0001" w:tentative="1">
@@ -7879,7 +7690,7 @@
         <w:ind w:left="5760" w:hanging="360"/>
       </w:pPr>
       <w:rPr>
-        <w:rFonts w:ascii="Symbol" w:hAnsi="Symbol" w:hint="default"/>
+        <w:rFonts w:hint="default" w:ascii="Symbol" w:hAnsi="Symbol"/>
       </w:rPr>
     </w:lvl>
     <w:lvl w:ilvl="7" w:tplc="240A0003" w:tentative="1">
@@ -7891,7 +7702,7 @@
         <w:ind w:left="6480" w:hanging="360"/>
       </w:pPr>
       <w:rPr>
-        <w:rFonts w:ascii="Courier New" w:hAnsi="Courier New" w:cs="Courier New" w:hint="default"/>
+        <w:rFonts w:hint="default" w:ascii="Courier New" w:hAnsi="Courier New" w:cs="Courier New"/>
       </w:rPr>
     </w:lvl>
     <w:lvl w:ilvl="8" w:tplc="240A0005" w:tentative="1">
@@ -7903,7 +7714,7 @@
         <w:ind w:left="7200" w:hanging="360"/>
       </w:pPr>
       <w:rPr>
-        <w:rFonts w:ascii="Wingdings" w:hAnsi="Wingdings" w:hint="default"/>
+        <w:rFonts w:hint="default" w:ascii="Wingdings" w:hAnsi="Wingdings"/>
       </w:rPr>
     </w:lvl>
   </w:abstractNum>
@@ -7999,7 +7810,7 @@
   <w:docDefaults>
     <w:rPrDefault>
       <w:rPr>
-        <w:rFonts w:asciiTheme="minorHAnsi" w:eastAsiaTheme="minorHAnsi" w:hAnsiTheme="minorHAnsi" w:cstheme="minorBidi"/>
+        <w:rFonts w:asciiTheme="minorHAnsi" w:hAnsiTheme="minorHAnsi" w:eastAsiaTheme="minorHAnsi" w:cstheme="minorBidi"/>
         <w:sz w:val="22"/>
         <w:szCs w:val="22"/>
         <w:lang w:val="es-CO" w:eastAsia="en-US" w:bidi="ar-SA"/>
@@ -8014,14 +7825,14 @@
   <w:latentStyles w:defLockedState="0" w:defUIPriority="99" w:defSemiHidden="0" w:defUnhideWhenUsed="0" w:defQFormat="0" w:count="376">
     <w:lsdException w:name="Normal" w:uiPriority="0" w:qFormat="1"/>
     <w:lsdException w:name="heading 1" w:uiPriority="9" w:qFormat="1"/>
-    <w:lsdException w:name="heading 2" w:semiHidden="1" w:uiPriority="9" w:unhideWhenUsed="1" w:qFormat="1"/>
-    <w:lsdException w:name="heading 3" w:semiHidden="1" w:uiPriority="9" w:unhideWhenUsed="1" w:qFormat="1"/>
-    <w:lsdException w:name="heading 4" w:semiHidden="1" w:uiPriority="9" w:unhideWhenUsed="1" w:qFormat="1"/>
-    <w:lsdException w:name="heading 5" w:semiHidden="1" w:uiPriority="9" w:unhideWhenUsed="1" w:qFormat="1"/>
-    <w:lsdException w:name="heading 6" w:semiHidden="1" w:uiPriority="9" w:unhideWhenUsed="1" w:qFormat="1"/>
-    <w:lsdException w:name="heading 7" w:semiHidden="1" w:uiPriority="9" w:unhideWhenUsed="1" w:qFormat="1"/>
-    <w:lsdException w:name="heading 8" w:semiHidden="1" w:uiPriority="9" w:unhideWhenUsed="1" w:qFormat="1"/>
-    <w:lsdException w:name="heading 9" w:semiHidden="1" w:uiPriority="9" w:unhideWhenUsed="1" w:qFormat="1"/>
+    <w:lsdException w:name="heading 2" w:uiPriority="9" w:semiHidden="1" w:unhideWhenUsed="1" w:qFormat="1"/>
+    <w:lsdException w:name="heading 3" w:uiPriority="9" w:semiHidden="1" w:unhideWhenUsed="1" w:qFormat="1"/>
+    <w:lsdException w:name="heading 4" w:uiPriority="9" w:semiHidden="1" w:unhideWhenUsed="1" w:qFormat="1"/>
+    <w:lsdException w:name="heading 5" w:uiPriority="9" w:semiHidden="1" w:unhideWhenUsed="1" w:qFormat="1"/>
+    <w:lsdException w:name="heading 6" w:uiPriority="9" w:semiHidden="1" w:unhideWhenUsed="1" w:qFormat="1"/>
+    <w:lsdException w:name="heading 7" w:uiPriority="9" w:semiHidden="1" w:unhideWhenUsed="1" w:qFormat="1"/>
+    <w:lsdException w:name="heading 8" w:uiPriority="9" w:semiHidden="1" w:unhideWhenUsed="1" w:qFormat="1"/>
+    <w:lsdException w:name="heading 9" w:uiPriority="9" w:semiHidden="1" w:unhideWhenUsed="1" w:qFormat="1"/>
     <w:lsdException w:name="index 1" w:semiHidden="1" w:unhideWhenUsed="1"/>
     <w:lsdException w:name="index 2" w:semiHidden="1" w:unhideWhenUsed="1"/>
     <w:lsdException w:name="index 3" w:semiHidden="1" w:unhideWhenUsed="1"/>
@@ -8031,22 +7842,22 @@
     <w:lsdException w:name="index 7" w:semiHidden="1" w:unhideWhenUsed="1"/>
     <w:lsdException w:name="index 8" w:semiHidden="1" w:unhideWhenUsed="1"/>
     <w:lsdException w:name="index 9" w:semiHidden="1" w:unhideWhenUsed="1"/>
-    <w:lsdException w:name="toc 1" w:semiHidden="1" w:uiPriority="39" w:unhideWhenUsed="1"/>
-    <w:lsdException w:name="toc 2" w:semiHidden="1" w:uiPriority="39" w:unhideWhenUsed="1"/>
-    <w:lsdException w:name="toc 3" w:semiHidden="1" w:uiPriority="39" w:unhideWhenUsed="1"/>
-    <w:lsdException w:name="toc 4" w:semiHidden="1" w:uiPriority="39" w:unhideWhenUsed="1"/>
-    <w:lsdException w:name="toc 5" w:semiHidden="1" w:uiPriority="39" w:unhideWhenUsed="1"/>
-    <w:lsdException w:name="toc 6" w:semiHidden="1" w:uiPriority="39" w:unhideWhenUsed="1"/>
-    <w:lsdException w:name="toc 7" w:semiHidden="1" w:uiPriority="39" w:unhideWhenUsed="1"/>
-    <w:lsdException w:name="toc 8" w:semiHidden="1" w:uiPriority="39" w:unhideWhenUsed="1"/>
-    <w:lsdException w:name="toc 9" w:semiHidden="1" w:uiPriority="39" w:unhideWhenUsed="1"/>
+    <w:lsdException w:name="toc 1" w:uiPriority="39" w:semiHidden="1" w:unhideWhenUsed="1"/>
+    <w:lsdException w:name="toc 2" w:uiPriority="39" w:semiHidden="1" w:unhideWhenUsed="1"/>
+    <w:lsdException w:name="toc 3" w:uiPriority="39" w:semiHidden="1" w:unhideWhenUsed="1"/>
+    <w:lsdException w:name="toc 4" w:uiPriority="39" w:semiHidden="1" w:unhideWhenUsed="1"/>
+    <w:lsdException w:name="toc 5" w:uiPriority="39" w:semiHidden="1" w:unhideWhenUsed="1"/>
+    <w:lsdException w:name="toc 6" w:uiPriority="39" w:semiHidden="1" w:unhideWhenUsed="1"/>
+    <w:lsdException w:name="toc 7" w:uiPriority="39" w:semiHidden="1" w:unhideWhenUsed="1"/>
+    <w:lsdException w:name="toc 8" w:uiPriority="39" w:semiHidden="1" w:unhideWhenUsed="1"/>
+    <w:lsdException w:name="toc 9" w:uiPriority="39" w:semiHidden="1" w:unhideWhenUsed="1"/>
     <w:lsdException w:name="Normal Indent" w:semiHidden="1" w:unhideWhenUsed="1"/>
     <w:lsdException w:name="footnote text" w:semiHidden="1" w:unhideWhenUsed="1"/>
     <w:lsdException w:name="annotation text" w:semiHidden="1" w:unhideWhenUsed="1"/>
     <w:lsdException w:name="header" w:semiHidden="1" w:unhideWhenUsed="1"/>
     <w:lsdException w:name="footer" w:semiHidden="1" w:unhideWhenUsed="1"/>
     <w:lsdException w:name="index heading" w:semiHidden="1" w:unhideWhenUsed="1"/>
-    <w:lsdException w:name="caption" w:semiHidden="1" w:uiPriority="35" w:unhideWhenUsed="1" w:qFormat="1"/>
+    <w:lsdException w:name="caption" w:uiPriority="35" w:semiHidden="1" w:unhideWhenUsed="1" w:qFormat="1"/>
     <w:lsdException w:name="table of figures" w:semiHidden="1" w:unhideWhenUsed="1"/>
     <w:lsdException w:name="envelope address" w:semiHidden="1" w:unhideWhenUsed="1"/>
     <w:lsdException w:name="envelope return" w:semiHidden="1" w:unhideWhenUsed="1"/>
@@ -8077,7 +7888,7 @@
     <w:lsdException w:name="Title" w:uiPriority="10" w:qFormat="1"/>
     <w:lsdException w:name="Closing" w:semiHidden="1" w:unhideWhenUsed="1"/>
     <w:lsdException w:name="Signature" w:semiHidden="1" w:unhideWhenUsed="1"/>
-    <w:lsdException w:name="Default Paragraph Font" w:semiHidden="1" w:uiPriority="1" w:unhideWhenUsed="1"/>
+    <w:lsdException w:name="Default Paragraph Font" w:uiPriority="1" w:semiHidden="1" w:unhideWhenUsed="1"/>
     <w:lsdException w:name="Body Text" w:semiHidden="1" w:unhideWhenUsed="1"/>
     <w:lsdException w:name="Body Text Indent" w:semiHidden="1" w:unhideWhenUsed="1"/>
     <w:lsdException w:name="List Continue" w:semiHidden="1" w:unhideWhenUsed="1"/>
@@ -8277,8 +8088,8 @@
     <w:lsdException w:name="Subtle Reference" w:uiPriority="31" w:qFormat="1"/>
     <w:lsdException w:name="Intense Reference" w:uiPriority="32" w:qFormat="1"/>
     <w:lsdException w:name="Book Title" w:uiPriority="33" w:qFormat="1"/>
-    <w:lsdException w:name="Bibliography" w:semiHidden="1" w:uiPriority="37" w:unhideWhenUsed="1"/>
-    <w:lsdException w:name="TOC Heading" w:semiHidden="1" w:uiPriority="39" w:unhideWhenUsed="1" w:qFormat="1"/>
+    <w:lsdException w:name="Bibliography" w:uiPriority="37" w:semiHidden="1" w:unhideWhenUsed="1"/>
+    <w:lsdException w:name="TOC Heading" w:uiPriority="39" w:semiHidden="1" w:unhideWhenUsed="1" w:qFormat="1"/>
     <w:lsdException w:name="Plain Table 1" w:uiPriority="41"/>
     <w:lsdException w:name="Plain Table 2" w:uiPriority="42"/>
     <w:lsdException w:name="Plain Table 3" w:uiPriority="43"/>
@@ -8389,18 +8200,18 @@
     <w:lsdException w:name="Unresolved Mention" w:semiHidden="1" w:unhideWhenUsed="1"/>
     <w:lsdException w:name="Smart Link" w:semiHidden="1" w:unhideWhenUsed="1"/>
   </w:latentStyles>
-  <w:style w:type="paragraph" w:default="1" w:styleId="Normal">
+  <w:style w:type="paragraph" w:styleId="Normal" w:default="1">
     <w:name w:val="Normal"/>
     <w:qFormat/>
     <w:rsid w:val="00A87308"/>
   </w:style>
-  <w:style w:type="character" w:default="1" w:styleId="Fuentedeprrafopredeter">
+  <w:style w:type="character" w:styleId="Fuentedeprrafopredeter" w:default="1">
     <w:name w:val="Default Paragraph Font"/>
     <w:uiPriority w:val="1"/>
     <w:semiHidden/>
     <w:unhideWhenUsed/>
   </w:style>
-  <w:style w:type="table" w:default="1" w:styleId="Tablanormal">
+  <w:style w:type="table" w:styleId="Tablanormal" w:default="1">
     <w:name w:val="Normal Table"/>
     <w:uiPriority w:val="99"/>
     <w:semiHidden/>
@@ -8415,7 +8226,7 @@
       </w:tblCellMar>
     </w:tblPr>
   </w:style>
-  <w:style w:type="numbering" w:default="1" w:styleId="Sinlista">
+  <w:style w:type="numbering" w:styleId="Sinlista" w:default="1">
     <w:name w:val="No List"/>
     <w:uiPriority w:val="99"/>
     <w:semiHidden/>
@@ -8442,12 +8253,12 @@
     </w:pPr>
     <w:tblPr>
       <w:tblBorders>
-        <w:top w:val="single" w:sz="4" w:space="0" w:color="auto"/>
-        <w:left w:val="single" w:sz="4" w:space="0" w:color="auto"/>
-        <w:bottom w:val="single" w:sz="4" w:space="0" w:color="auto"/>
-        <w:right w:val="single" w:sz="4" w:space="0" w:color="auto"/>
-        <w:insideH w:val="single" w:sz="4" w:space="0" w:color="auto"/>
-        <w:insideV w:val="single" w:sz="4" w:space="0" w:color="auto"/>
+        <w:top w:val="single" w:color="auto" w:sz="4" w:space="0"/>
+        <w:left w:val="single" w:color="auto" w:sz="4" w:space="0"/>
+        <w:bottom w:val="single" w:color="auto" w:sz="4" w:space="0"/>
+        <w:right w:val="single" w:color="auto" w:sz="4" w:space="0"/>
+        <w:insideH w:val="single" w:color="auto" w:sz="4" w:space="0"/>
+        <w:insideV w:val="single" w:color="auto" w:sz="4" w:space="0"/>
       </w:tblBorders>
     </w:tblPr>
   </w:style>
@@ -8485,7 +8296,7 @@
       <w:spacing w:before="100" w:beforeAutospacing="1" w:after="100" w:afterAutospacing="1" w:line="240" w:lineRule="auto"/>
     </w:pPr>
     <w:rPr>
-      <w:rFonts w:ascii="Times New Roman" w:eastAsia="Times New Roman" w:hAnsi="Times New Roman" w:cs="Times New Roman"/>
+      <w:rFonts w:ascii="Times New Roman" w:hAnsi="Times New Roman" w:eastAsia="Times New Roman" w:cs="Times New Roman"/>
       <w:sz w:val="24"/>
       <w:szCs w:val="24"/>
       <w:lang w:eastAsia="es-CO"/>
@@ -8506,7 +8317,7 @@
 </file>
 
 <file path=word/theme/theme1.xml><?xml version="1.0" encoding="utf-8"?>
-<a:theme xmlns:a="http://schemas.openxmlformats.org/drawingml/2006/main" name="Tema de Office">
+<a:theme xmlns:a="http://schemas.openxmlformats.org/drawingml/2006/main" xmlns:thm15="http://schemas.microsoft.com/office/thememl/2012/main" name="Tema de Office">
   <a:themeElements>
     <a:clrScheme name="Office">
       <a:dk1>

</xml_diff>